<commit_message>
Close out: Study 2 only; economic belief nodes; new figures and prose
- Paper now uses ISSP 2020 (Study 2) only; Study 1 removed from the manuscript
- Add market (v3) and redistribute (v4) single-item belief nodes; re-run all
  28 country networks with bootstraps (rank-1 belief unchanged everywhere)
- Save pooled belief-only network; new pooled with/without-behavior figure
  and Brandt et al. (2019)-style shortest-path figure
- Draft Study-1-free Data and Measures / Results prose with inline values
- Supplement S2: explain survey-battery grouping vs EGA solution
- scripts/robustness-envcom.R: envcom without / with separate
  willingness-to-pay items (the lead is mostly driven by those items)
- Update LOG and README

Co-Authored-By: Claude Opus 5.5 <noreply@anthropic.com>
</commit_message>
<xml_diff>
--- a/_output/environ-beliefs-supplement.docx
+++ b/_output/environ-beliefs-supplement.docx
@@ -4622,6 +4622,14 @@
       <w:pPr>
         <w:pStyle w:val="BodyText"/>
       </w:pPr>
+      <w:r>
+        <w:t xml:space="preserve">The survey battery grouping assigns each item to the part of the questionnaire in which it was asked. Concern is its own group, the climate change item joins the items about the environment and the economy, and the remaining groups are willingness to make sacrifices for the environment, personal efficacy and commitment, the danger of specific hazards, and enjoyment of nature. This six-group structure has a TEFI of -21.0, compared with -31.4 for the Louvain solution, so responses do not sort cleanly by where the items appear in the questionnaire. The hazard items and the two nature items hold together as their own communities. However, the items about willingness to pay higher prices, pay higher taxes, and cut one’s standard of living join concern, doing what is right even when it costs more, and the view that environmental problems affect everyday life to form an environmental commitment community. The remaining sacrifice item, accepting a reduction in protected nature areas for economic development, joins most of the environment and economy items and most of the efficacy and commitment items in an ecological worldview community.</w:t>
+      </w:r>
+    </w:p>
+    <w:p>
+      <w:pPr>
+        <w:pStyle w:val="BodyText"/>
+      </w:pPr>
       <w:hyperlink w:anchor="tbl-issp-comm">
         <w:r>
           <w:rPr>
@@ -7846,20 +7854,20 @@
                     <w:jc w:val="center"/>
                   </w:pPr>
                   <w:r>
-                    <w:t xml:space="preserve">4.5 [3.8, 6.0]</w:t>
-                  </w:r>
-                </w:p>
-              </w:tc>
-              <w:tc>
-                <w:tcPr/>
-                <w:p>
-                  <w:pPr>
-                    <w:pStyle w:val="Compact"/>
-                    <w:jc w:val="left"/>
-                    <w:jc w:val="center"/>
-                  </w:pPr>
-                  <w:r>
-                    <w:t xml:space="preserve">0.93</w:t>
+                    <w:t xml:space="preserve">4.4 [3.7, 5.8]</w:t>
+                  </w:r>
+                </w:p>
+              </w:tc>
+              <w:tc>
+                <w:tcPr/>
+                <w:p>
+                  <w:pPr>
+                    <w:pStyle w:val="Compact"/>
+                    <w:jc w:val="left"/>
+                    <w:jc w:val="center"/>
+                  </w:pPr>
+                  <w:r>
+                    <w:t xml:space="preserve">0.97</w:t>
                   </w:r>
                 </w:p>
               </w:tc>
@@ -7900,20 +7908,20 @@
                     <w:jc w:val="center"/>
                   </w:pPr>
                   <w:r>
-                    <w:t xml:space="preserve">6.2 [4.4, 8.6]</w:t>
-                  </w:r>
-                </w:p>
-              </w:tc>
-              <w:tc>
-                <w:tcPr/>
-                <w:p>
-                  <w:pPr>
-                    <w:pStyle w:val="Compact"/>
-                    <w:jc w:val="left"/>
-                    <w:jc w:val="center"/>
-                  </w:pPr>
-                  <w:r>
-                    <w:t xml:space="preserve">0.53</w:t>
+                    <w:t xml:space="preserve">6.6 [5.0, 9.8]</w:t>
+                  </w:r>
+                </w:p>
+              </w:tc>
+              <w:tc>
+                <w:tcPr/>
+                <w:p>
+                  <w:pPr>
+                    <w:pStyle w:val="Compact"/>
+                    <w:jc w:val="left"/>
+                    <w:jc w:val="center"/>
+                  </w:pPr>
+                  <w:r>
+                    <w:t xml:space="preserve">0.35</w:t>
                   </w:r>
                 </w:p>
               </w:tc>
@@ -7954,7 +7962,7 @@
                     <w:jc w:val="center"/>
                   </w:pPr>
                   <w:r>
-                    <w:t xml:space="preserve">4.7 [4.3, 5.4]</w:t>
+                    <w:t xml:space="preserve">4.8 [4.3, 5.4]</w:t>
                   </w:r>
                 </w:p>
               </w:tc>
@@ -8008,7 +8016,7 @@
                     <w:jc w:val="center"/>
                   </w:pPr>
                   <w:r>
-                    <w:t xml:space="preserve">5.0 [4.3, 6.0]</w:t>
+                    <w:t xml:space="preserve">5.2 [4.5, 6.4]</w:t>
                   </w:r>
                 </w:p>
               </w:tc>
@@ -8062,7 +8070,7 @@
                     <w:jc w:val="center"/>
                   </w:pPr>
                   <w:r>
-                    <w:t xml:space="preserve">5.0 [4.2, 6.2]</w:t>
+                    <w:t xml:space="preserve">5.1 [4.3, 6.3]</w:t>
                   </w:r>
                 </w:p>
               </w:tc>
@@ -8116,7 +8124,7 @@
                     <w:jc w:val="center"/>
                   </w:pPr>
                   <w:r>
-                    <w:t xml:space="preserve">4.3 [3.6, 5.6]</w:t>
+                    <w:t xml:space="preserve">4.3 [3.6, 5.7]</w:t>
                   </w:r>
                 </w:p>
               </w:tc>
@@ -8170,7 +8178,493 @@
                     <w:jc w:val="center"/>
                   </w:pPr>
                   <w:r>
-                    <w:t xml:space="preserve">6.0 [5.1, 7.1]</w:t>
+                    <w:t xml:space="preserve">6.3 [5.2, 7.3]</w:t>
+                  </w:r>
+                </w:p>
+              </w:tc>
+              <w:tc>
+                <w:tcPr/>
+                <w:p>
+                  <w:pPr>
+                    <w:pStyle w:val="Compact"/>
+                    <w:jc w:val="left"/>
+                    <w:jc w:val="center"/>
+                  </w:pPr>
+                  <w:r>
+                    <w:t xml:space="preserve">0.99</w:t>
+                  </w:r>
+                </w:p>
+              </w:tc>
+            </w:tr>
+            <w:tr>
+              <w:tc>
+                <w:tcPr/>
+                <w:p>
+                  <w:pPr>
+                    <w:pStyle w:val="Compact"/>
+                    <w:jc w:val="left"/>
+                    <w:jc w:val="center"/>
+                  </w:pPr>
+                  <w:r>
+                    <w:t xml:space="preserve">FI</w:t>
+                  </w:r>
+                </w:p>
+              </w:tc>
+              <w:tc>
+                <w:tcPr/>
+                <w:p>
+                  <w:pPr>
+                    <w:pStyle w:val="Compact"/>
+                    <w:jc w:val="left"/>
+                    <w:jc w:val="center"/>
+                  </w:pPr>
+                  <w:r>
+                    <w:t xml:space="preserve">envcom</w:t>
+                  </w:r>
+                </w:p>
+              </w:tc>
+              <w:tc>
+                <w:tcPr/>
+                <w:p>
+                  <w:pPr>
+                    <w:pStyle w:val="Compact"/>
+                    <w:jc w:val="left"/>
+                    <w:jc w:val="center"/>
+                  </w:pPr>
+                  <w:r>
+                    <w:t xml:space="preserve">5.0 [4.5, 5.8]</w:t>
+                  </w:r>
+                </w:p>
+              </w:tc>
+              <w:tc>
+                <w:tcPr/>
+                <w:p>
+                  <w:pPr>
+                    <w:pStyle w:val="Compact"/>
+                    <w:jc w:val="left"/>
+                    <w:jc w:val="center"/>
+                  </w:pPr>
+                  <w:r>
+                    <w:t xml:space="preserve">0.89</w:t>
+                  </w:r>
+                </w:p>
+              </w:tc>
+            </w:tr>
+            <w:tr>
+              <w:tc>
+                <w:tcPr/>
+                <w:p>
+                  <w:pPr>
+                    <w:pStyle w:val="Compact"/>
+                    <w:jc w:val="left"/>
+                    <w:jc w:val="center"/>
+                  </w:pPr>
+                  <w:r>
+                    <w:t xml:space="preserve">FR</w:t>
+                  </w:r>
+                </w:p>
+              </w:tc>
+              <w:tc>
+                <w:tcPr/>
+                <w:p>
+                  <w:pPr>
+                    <w:pStyle w:val="Compact"/>
+                    <w:jc w:val="left"/>
+                    <w:jc w:val="center"/>
+                  </w:pPr>
+                  <w:r>
+                    <w:t xml:space="preserve">envcom</w:t>
+                  </w:r>
+                </w:p>
+              </w:tc>
+              <w:tc>
+                <w:tcPr/>
+                <w:p>
+                  <w:pPr>
+                    <w:pStyle w:val="Compact"/>
+                    <w:jc w:val="left"/>
+                    <w:jc w:val="center"/>
+                  </w:pPr>
+                  <w:r>
+                    <w:t xml:space="preserve">5.2 [4.3, 6.6]</w:t>
+                  </w:r>
+                </w:p>
+              </w:tc>
+              <w:tc>
+                <w:tcPr/>
+                <w:p>
+                  <w:pPr>
+                    <w:pStyle w:val="Compact"/>
+                    <w:jc w:val="left"/>
+                    <w:jc w:val="center"/>
+                  </w:pPr>
+                  <w:r>
+                    <w:t xml:space="preserve">0.91</w:t>
+                  </w:r>
+                </w:p>
+              </w:tc>
+            </w:tr>
+            <w:tr>
+              <w:tc>
+                <w:tcPr/>
+                <w:p>
+                  <w:pPr>
+                    <w:pStyle w:val="Compact"/>
+                    <w:jc w:val="left"/>
+                    <w:jc w:val="center"/>
+                  </w:pPr>
+                  <w:r>
+                    <w:t xml:space="preserve">HR</w:t>
+                  </w:r>
+                </w:p>
+              </w:tc>
+              <w:tc>
+                <w:tcPr/>
+                <w:p>
+                  <w:pPr>
+                    <w:pStyle w:val="Compact"/>
+                    <w:jc w:val="left"/>
+                    <w:jc w:val="center"/>
+                  </w:pPr>
+                  <w:r>
+                    <w:t xml:space="preserve">envcom</w:t>
+                  </w:r>
+                </w:p>
+              </w:tc>
+              <w:tc>
+                <w:tcPr/>
+                <w:p>
+                  <w:pPr>
+                    <w:pStyle w:val="Compact"/>
+                    <w:jc w:val="left"/>
+                    <w:jc w:val="center"/>
+                  </w:pPr>
+                  <w:r>
+                    <w:t xml:space="preserve">5.6 [4.4, 7.6]</w:t>
+                  </w:r>
+                </w:p>
+              </w:tc>
+              <w:tc>
+                <w:tcPr/>
+                <w:p>
+                  <w:pPr>
+                    <w:pStyle w:val="Compact"/>
+                    <w:jc w:val="left"/>
+                    <w:jc w:val="center"/>
+                  </w:pPr>
+                  <w:r>
+                    <w:t xml:space="preserve">0.90</w:t>
+                  </w:r>
+                </w:p>
+              </w:tc>
+            </w:tr>
+            <w:tr>
+              <w:tc>
+                <w:tcPr/>
+                <w:p>
+                  <w:pPr>
+                    <w:pStyle w:val="Compact"/>
+                    <w:jc w:val="left"/>
+                    <w:jc w:val="center"/>
+                  </w:pPr>
+                  <w:r>
+                    <w:t xml:space="preserve">HU</w:t>
+                  </w:r>
+                </w:p>
+              </w:tc>
+              <w:tc>
+                <w:tcPr/>
+                <w:p>
+                  <w:pPr>
+                    <w:pStyle w:val="Compact"/>
+                    <w:jc w:val="left"/>
+                    <w:jc w:val="center"/>
+                  </w:pPr>
+                  <w:r>
+                    <w:t xml:space="preserve">envcom</w:t>
+                  </w:r>
+                </w:p>
+              </w:tc>
+              <w:tc>
+                <w:tcPr/>
+                <w:p>
+                  <w:pPr>
+                    <w:pStyle w:val="Compact"/>
+                    <w:jc w:val="left"/>
+                    <w:jc w:val="center"/>
+                  </w:pPr>
+                  <w:r>
+                    <w:t xml:space="preserve">4.2 [3.3, 6.0]</w:t>
+                  </w:r>
+                </w:p>
+              </w:tc>
+              <w:tc>
+                <w:tcPr/>
+                <w:p>
+                  <w:pPr>
+                    <w:pStyle w:val="Compact"/>
+                    <w:jc w:val="left"/>
+                    <w:jc w:val="center"/>
+                  </w:pPr>
+                  <w:r>
+                    <w:t xml:space="preserve">1.00</w:t>
+                  </w:r>
+                </w:p>
+              </w:tc>
+            </w:tr>
+            <w:tr>
+              <w:tc>
+                <w:tcPr/>
+                <w:p>
+                  <w:pPr>
+                    <w:pStyle w:val="Compact"/>
+                    <w:jc w:val="left"/>
+                    <w:jc w:val="center"/>
+                  </w:pPr>
+                  <w:r>
+                    <w:t xml:space="preserve">IN</w:t>
+                  </w:r>
+                </w:p>
+              </w:tc>
+              <w:tc>
+                <w:tcPr/>
+                <w:p>
+                  <w:pPr>
+                    <w:pStyle w:val="Compact"/>
+                    <w:jc w:val="left"/>
+                    <w:jc w:val="center"/>
+                  </w:pPr>
+                  <w:r>
+                    <w:t xml:space="preserve">nature</w:t>
+                  </w:r>
+                </w:p>
+              </w:tc>
+              <w:tc>
+                <w:tcPr/>
+                <w:p>
+                  <w:pPr>
+                    <w:pStyle w:val="Compact"/>
+                    <w:jc w:val="left"/>
+                    <w:jc w:val="center"/>
+                  </w:pPr>
+                  <w:r>
+                    <w:t xml:space="preserve">8.0 [5.8, 11.4]</w:t>
+                  </w:r>
+                </w:p>
+              </w:tc>
+              <w:tc>
+                <w:tcPr/>
+                <w:p>
+                  <w:pPr>
+                    <w:pStyle w:val="Compact"/>
+                    <w:jc w:val="left"/>
+                    <w:jc w:val="center"/>
+                  </w:pPr>
+                  <w:r>
+                    <w:t xml:space="preserve">0.97</w:t>
+                  </w:r>
+                </w:p>
+              </w:tc>
+            </w:tr>
+            <w:tr>
+              <w:tc>
+                <w:tcPr/>
+                <w:p>
+                  <w:pPr>
+                    <w:pStyle w:val="Compact"/>
+                    <w:jc w:val="left"/>
+                    <w:jc w:val="center"/>
+                  </w:pPr>
+                  <w:r>
+                    <w:t xml:space="preserve">IS</w:t>
+                  </w:r>
+                </w:p>
+              </w:tc>
+              <w:tc>
+                <w:tcPr/>
+                <w:p>
+                  <w:pPr>
+                    <w:pStyle w:val="Compact"/>
+                    <w:jc w:val="left"/>
+                    <w:jc w:val="center"/>
+                  </w:pPr>
+                  <w:r>
+                    <w:t xml:space="preserve">envcom</w:t>
+                  </w:r>
+                </w:p>
+              </w:tc>
+              <w:tc>
+                <w:tcPr/>
+                <w:p>
+                  <w:pPr>
+                    <w:pStyle w:val="Compact"/>
+                    <w:jc w:val="left"/>
+                    <w:jc w:val="center"/>
+                  </w:pPr>
+                  <w:r>
+                    <w:t xml:space="preserve">6.1 [4.9, 7.7]</w:t>
+                  </w:r>
+                </w:p>
+              </w:tc>
+              <w:tc>
+                <w:tcPr/>
+                <w:p>
+                  <w:pPr>
+                    <w:pStyle w:val="Compact"/>
+                    <w:jc w:val="left"/>
+                    <w:jc w:val="center"/>
+                  </w:pPr>
+                  <w:r>
+                    <w:t xml:space="preserve">0.68</w:t>
+                  </w:r>
+                </w:p>
+              </w:tc>
+            </w:tr>
+            <w:tr>
+              <w:tc>
+                <w:tcPr/>
+                <w:p>
+                  <w:pPr>
+                    <w:pStyle w:val="Compact"/>
+                    <w:jc w:val="left"/>
+                    <w:jc w:val="center"/>
+                  </w:pPr>
+                  <w:r>
+                    <w:t xml:space="preserve">IT</w:t>
+                  </w:r>
+                </w:p>
+              </w:tc>
+              <w:tc>
+                <w:tcPr/>
+                <w:p>
+                  <w:pPr>
+                    <w:pStyle w:val="Compact"/>
+                    <w:jc w:val="left"/>
+                    <w:jc w:val="center"/>
+                  </w:pPr>
+                  <w:r>
+                    <w:t xml:space="preserve">envcom</w:t>
+                  </w:r>
+                </w:p>
+              </w:tc>
+              <w:tc>
+                <w:tcPr/>
+                <w:p>
+                  <w:pPr>
+                    <w:pStyle w:val="Compact"/>
+                    <w:jc w:val="left"/>
+                    <w:jc w:val="center"/>
+                  </w:pPr>
+                  <w:r>
+                    <w:t xml:space="preserve">3.3 [2.8, 3.9]</w:t>
+                  </w:r>
+                </w:p>
+              </w:tc>
+              <w:tc>
+                <w:tcPr/>
+                <w:p>
+                  <w:pPr>
+                    <w:pStyle w:val="Compact"/>
+                    <w:jc w:val="left"/>
+                    <w:jc w:val="center"/>
+                  </w:pPr>
+                  <w:r>
+                    <w:t xml:space="preserve">1.00</w:t>
+                  </w:r>
+                </w:p>
+              </w:tc>
+            </w:tr>
+            <w:tr>
+              <w:tc>
+                <w:tcPr/>
+                <w:p>
+                  <w:pPr>
+                    <w:pStyle w:val="Compact"/>
+                    <w:jc w:val="left"/>
+                    <w:jc w:val="center"/>
+                  </w:pPr>
+                  <w:r>
+                    <w:t xml:space="preserve">JP</w:t>
+                  </w:r>
+                </w:p>
+              </w:tc>
+              <w:tc>
+                <w:tcPr/>
+                <w:p>
+                  <w:pPr>
+                    <w:pStyle w:val="Compact"/>
+                    <w:jc w:val="left"/>
+                    <w:jc w:val="center"/>
+                  </w:pPr>
+                  <w:r>
+                    <w:t xml:space="preserve">envcom</w:t>
+                  </w:r>
+                </w:p>
+              </w:tc>
+              <w:tc>
+                <w:tcPr/>
+                <w:p>
+                  <w:pPr>
+                    <w:pStyle w:val="Compact"/>
+                    <w:jc w:val="left"/>
+                    <w:jc w:val="center"/>
+                  </w:pPr>
+                  <w:r>
+                    <w:t xml:space="preserve">4.9 [4.0, 7.2]</w:t>
+                  </w:r>
+                </w:p>
+              </w:tc>
+              <w:tc>
+                <w:tcPr/>
+                <w:p>
+                  <w:pPr>
+                    <w:pStyle w:val="Compact"/>
+                    <w:jc w:val="left"/>
+                    <w:jc w:val="center"/>
+                  </w:pPr>
+                  <w:r>
+                    <w:t xml:space="preserve">0.98</w:t>
+                  </w:r>
+                </w:p>
+              </w:tc>
+            </w:tr>
+            <w:tr>
+              <w:tc>
+                <w:tcPr/>
+                <w:p>
+                  <w:pPr>
+                    <w:pStyle w:val="Compact"/>
+                    <w:jc w:val="left"/>
+                    <w:jc w:val="center"/>
+                  </w:pPr>
+                  <w:r>
+                    <w:t xml:space="preserve">KR</w:t>
+                  </w:r>
+                </w:p>
+              </w:tc>
+              <w:tc>
+                <w:tcPr/>
+                <w:p>
+                  <w:pPr>
+                    <w:pStyle w:val="Compact"/>
+                    <w:jc w:val="left"/>
+                    <w:jc w:val="center"/>
+                  </w:pPr>
+                  <w:r>
+                    <w:t xml:space="preserve">envcom</w:t>
+                  </w:r>
+                </w:p>
+              </w:tc>
+              <w:tc>
+                <w:tcPr/>
+                <w:p>
+                  <w:pPr>
+                    <w:pStyle w:val="Compact"/>
+                    <w:jc w:val="left"/>
+                    <w:jc w:val="center"/>
+                  </w:pPr>
+                  <w:r>
+                    <w:t xml:space="preserve">8.4 [5.5, 11.3]</w:t>
                   </w:r>
                 </w:p>
               </w:tc>
@@ -8198,7 +8692,7 @@
                     <w:jc w:val="center"/>
                   </w:pPr>
                   <w:r>
-                    <w:t xml:space="preserve">FI</w:t>
+                    <w:t xml:space="preserve">LT</w:t>
                   </w:r>
                 </w:p>
               </w:tc>
@@ -8224,35 +8718,35 @@
                     <w:jc w:val="center"/>
                   </w:pPr>
                   <w:r>
-                    <w:t xml:space="preserve">4.8 [4.3, 5.7]</w:t>
-                  </w:r>
-                </w:p>
-              </w:tc>
-              <w:tc>
-                <w:tcPr/>
-                <w:p>
-                  <w:pPr>
-                    <w:pStyle w:val="Compact"/>
-                    <w:jc w:val="left"/>
-                    <w:jc w:val="center"/>
-                  </w:pPr>
-                  <w:r>
-                    <w:t xml:space="preserve">0.91</w:t>
-                  </w:r>
-                </w:p>
-              </w:tc>
-            </w:tr>
-            <w:tr>
-              <w:tc>
-                <w:tcPr/>
-                <w:p>
-                  <w:pPr>
-                    <w:pStyle w:val="Compact"/>
-                    <w:jc w:val="left"/>
-                    <w:jc w:val="center"/>
-                  </w:pPr>
-                  <w:r>
-                    <w:t xml:space="preserve">FR</w:t>
+                    <w:t xml:space="preserve">3.9 [3.4, 5.0]</w:t>
+                  </w:r>
+                </w:p>
+              </w:tc>
+              <w:tc>
+                <w:tcPr/>
+                <w:p>
+                  <w:pPr>
+                    <w:pStyle w:val="Compact"/>
+                    <w:jc w:val="left"/>
+                    <w:jc w:val="center"/>
+                  </w:pPr>
+                  <w:r>
+                    <w:t xml:space="preserve">1.00</w:t>
+                  </w:r>
+                </w:p>
+              </w:tc>
+            </w:tr>
+            <w:tr>
+              <w:tc>
+                <w:tcPr/>
+                <w:p>
+                  <w:pPr>
+                    <w:pStyle w:val="Compact"/>
+                    <w:jc w:val="left"/>
+                    <w:jc w:val="center"/>
+                  </w:pPr>
+                  <w:r>
+                    <w:t xml:space="preserve">NO</w:t>
                   </w:r>
                 </w:p>
               </w:tc>
@@ -8278,35 +8772,35 @@
                     <w:jc w:val="center"/>
                   </w:pPr>
                   <w:r>
-                    <w:t xml:space="preserve">5.2 [4.3, 6.7]</w:t>
-                  </w:r>
-                </w:p>
-              </w:tc>
-              <w:tc>
-                <w:tcPr/>
-                <w:p>
-                  <w:pPr>
-                    <w:pStyle w:val="Compact"/>
-                    <w:jc w:val="left"/>
-                    <w:jc w:val="center"/>
-                  </w:pPr>
-                  <w:r>
-                    <w:t xml:space="preserve">0.90</w:t>
-                  </w:r>
-                </w:p>
-              </w:tc>
-            </w:tr>
-            <w:tr>
-              <w:tc>
-                <w:tcPr/>
-                <w:p>
-                  <w:pPr>
-                    <w:pStyle w:val="Compact"/>
-                    <w:jc w:val="left"/>
-                    <w:jc w:val="center"/>
-                  </w:pPr>
-                  <w:r>
-                    <w:t xml:space="preserve">HR</w:t>
+                    <w:t xml:space="preserve">5.3 [4.3, 6.8]</w:t>
+                  </w:r>
+                </w:p>
+              </w:tc>
+              <w:tc>
+                <w:tcPr/>
+                <w:p>
+                  <w:pPr>
+                    <w:pStyle w:val="Compact"/>
+                    <w:jc w:val="left"/>
+                    <w:jc w:val="center"/>
+                  </w:pPr>
+                  <w:r>
+                    <w:t xml:space="preserve">0.97</w:t>
+                  </w:r>
+                </w:p>
+              </w:tc>
+            </w:tr>
+            <w:tr>
+              <w:tc>
+                <w:tcPr/>
+                <w:p>
+                  <w:pPr>
+                    <w:pStyle w:val="Compact"/>
+                    <w:jc w:val="left"/>
+                    <w:jc w:val="center"/>
+                  </w:pPr>
+                  <w:r>
+                    <w:t xml:space="preserve">NZ</w:t>
                   </w:r>
                 </w:p>
               </w:tc>
@@ -8332,35 +8826,89 @@
                     <w:jc w:val="center"/>
                   </w:pPr>
                   <w:r>
-                    <w:t xml:space="preserve">5.1 [4.1, 7.0]</w:t>
-                  </w:r>
-                </w:p>
-              </w:tc>
-              <w:tc>
-                <w:tcPr/>
-                <w:p>
-                  <w:pPr>
-                    <w:pStyle w:val="Compact"/>
-                    <w:jc w:val="left"/>
-                    <w:jc w:val="center"/>
-                  </w:pPr>
-                  <w:r>
-                    <w:t xml:space="preserve">0.68</w:t>
-                  </w:r>
-                </w:p>
-              </w:tc>
-            </w:tr>
-            <w:tr>
-              <w:tc>
-                <w:tcPr/>
-                <w:p>
-                  <w:pPr>
-                    <w:pStyle w:val="Compact"/>
-                    <w:jc w:val="left"/>
-                    <w:jc w:val="center"/>
-                  </w:pPr>
-                  <w:r>
-                    <w:t xml:space="preserve">HU</w:t>
+                    <w:t xml:space="preserve">5.7 [4.5, 7.7]</w:t>
+                  </w:r>
+                </w:p>
+              </w:tc>
+              <w:tc>
+                <w:tcPr/>
+                <w:p>
+                  <w:pPr>
+                    <w:pStyle w:val="Compact"/>
+                    <w:jc w:val="left"/>
+                    <w:jc w:val="center"/>
+                  </w:pPr>
+                  <w:r>
+                    <w:t xml:space="preserve">0.79</w:t>
+                  </w:r>
+                </w:p>
+              </w:tc>
+            </w:tr>
+            <w:tr>
+              <w:tc>
+                <w:tcPr/>
+                <w:p>
+                  <w:pPr>
+                    <w:pStyle w:val="Compact"/>
+                    <w:jc w:val="left"/>
+                    <w:jc w:val="center"/>
+                  </w:pPr>
+                  <w:r>
+                    <w:t xml:space="preserve">PH</w:t>
+                  </w:r>
+                </w:p>
+              </w:tc>
+              <w:tc>
+                <w:tcPr/>
+                <w:p>
+                  <w:pPr>
+                    <w:pStyle w:val="Compact"/>
+                    <w:jc w:val="left"/>
+                    <w:jc w:val="center"/>
+                  </w:pPr>
+                  <w:r>
+                    <w:t xml:space="preserve">nature</w:t>
+                  </w:r>
+                </w:p>
+              </w:tc>
+              <w:tc>
+                <w:tcPr/>
+                <w:p>
+                  <w:pPr>
+                    <w:pStyle w:val="Compact"/>
+                    <w:jc w:val="left"/>
+                    <w:jc w:val="center"/>
+                  </w:pPr>
+                  <w:r>
+                    <w:t xml:space="preserve">10.3 [7.8, 22.8]</w:t>
+                  </w:r>
+                </w:p>
+              </w:tc>
+              <w:tc>
+                <w:tcPr/>
+                <w:p>
+                  <w:pPr>
+                    <w:pStyle w:val="Compact"/>
+                    <w:jc w:val="left"/>
+                    <w:jc w:val="center"/>
+                  </w:pPr>
+                  <w:r>
+                    <w:t xml:space="preserve">0.77</w:t>
+                  </w:r>
+                </w:p>
+              </w:tc>
+            </w:tr>
+            <w:tr>
+              <w:tc>
+                <w:tcPr/>
+                <w:p>
+                  <w:pPr>
+                    <w:pStyle w:val="Compact"/>
+                    <w:jc w:val="left"/>
+                    <w:jc w:val="center"/>
+                  </w:pPr>
+                  <w:r>
+                    <w:t xml:space="preserve">RU</w:t>
                   </w:r>
                 </w:p>
               </w:tc>
@@ -8386,7 +8934,7 @@
                     <w:jc w:val="center"/>
                   </w:pPr>
                   <w:r>
-                    <w:t xml:space="preserve">3.9 [3.1, 5.4]</w:t>
+                    <w:t xml:space="preserve">4.7 [4.0, 6.2]</w:t>
                   </w:r>
                 </w:p>
               </w:tc>
@@ -8414,7 +8962,277 @@
                     <w:jc w:val="center"/>
                   </w:pPr>
                   <w:r>
-                    <w:t xml:space="preserve">IN</w:t>
+                    <w:t xml:space="preserve">SE</w:t>
+                  </w:r>
+                </w:p>
+              </w:tc>
+              <w:tc>
+                <w:tcPr/>
+                <w:p>
+                  <w:pPr>
+                    <w:pStyle w:val="Compact"/>
+                    <w:jc w:val="left"/>
+                    <w:jc w:val="center"/>
+                  </w:pPr>
+                  <w:r>
+                    <w:t xml:space="preserve">envcom</w:t>
+                  </w:r>
+                </w:p>
+              </w:tc>
+              <w:tc>
+                <w:tcPr/>
+                <w:p>
+                  <w:pPr>
+                    <w:pStyle w:val="Compact"/>
+                    <w:jc w:val="left"/>
+                    <w:jc w:val="center"/>
+                  </w:pPr>
+                  <w:r>
+                    <w:t xml:space="preserve">5.4 [4.6, 6.7]</w:t>
+                  </w:r>
+                </w:p>
+              </w:tc>
+              <w:tc>
+                <w:tcPr/>
+                <w:p>
+                  <w:pPr>
+                    <w:pStyle w:val="Compact"/>
+                    <w:jc w:val="left"/>
+                    <w:jc w:val="center"/>
+                  </w:pPr>
+                  <w:r>
+                    <w:t xml:space="preserve">0.96</w:t>
+                  </w:r>
+                </w:p>
+              </w:tc>
+            </w:tr>
+            <w:tr>
+              <w:tc>
+                <w:tcPr/>
+                <w:p>
+                  <w:pPr>
+                    <w:pStyle w:val="Compact"/>
+                    <w:jc w:val="left"/>
+                    <w:jc w:val="center"/>
+                  </w:pPr>
+                  <w:r>
+                    <w:t xml:space="preserve">SI</w:t>
+                  </w:r>
+                </w:p>
+              </w:tc>
+              <w:tc>
+                <w:tcPr/>
+                <w:p>
+                  <w:pPr>
+                    <w:pStyle w:val="Compact"/>
+                    <w:jc w:val="left"/>
+                    <w:jc w:val="center"/>
+                  </w:pPr>
+                  <w:r>
+                    <w:t xml:space="preserve">envcom</w:t>
+                  </w:r>
+                </w:p>
+              </w:tc>
+              <w:tc>
+                <w:tcPr/>
+                <w:p>
+                  <w:pPr>
+                    <w:pStyle w:val="Compact"/>
+                    <w:jc w:val="left"/>
+                    <w:jc w:val="center"/>
+                  </w:pPr>
+                  <w:r>
+                    <w:t xml:space="preserve">4.9 [3.9, 6.7]</w:t>
+                  </w:r>
+                </w:p>
+              </w:tc>
+              <w:tc>
+                <w:tcPr/>
+                <w:p>
+                  <w:pPr>
+                    <w:pStyle w:val="Compact"/>
+                    <w:jc w:val="left"/>
+                    <w:jc w:val="center"/>
+                  </w:pPr>
+                  <w:r>
+                    <w:t xml:space="preserve">1.00</w:t>
+                  </w:r>
+                </w:p>
+              </w:tc>
+            </w:tr>
+            <w:tr>
+              <w:tc>
+                <w:tcPr/>
+                <w:p>
+                  <w:pPr>
+                    <w:pStyle w:val="Compact"/>
+                    <w:jc w:val="left"/>
+                    <w:jc w:val="center"/>
+                  </w:pPr>
+                  <w:r>
+                    <w:t xml:space="preserve">SK</w:t>
+                  </w:r>
+                </w:p>
+              </w:tc>
+              <w:tc>
+                <w:tcPr/>
+                <w:p>
+                  <w:pPr>
+                    <w:pStyle w:val="Compact"/>
+                    <w:jc w:val="left"/>
+                    <w:jc w:val="center"/>
+                  </w:pPr>
+                  <w:r>
+                    <w:t xml:space="preserve">envcom</w:t>
+                  </w:r>
+                </w:p>
+              </w:tc>
+              <w:tc>
+                <w:tcPr/>
+                <w:p>
+                  <w:pPr>
+                    <w:pStyle w:val="Compact"/>
+                    <w:jc w:val="left"/>
+                    <w:jc w:val="center"/>
+                  </w:pPr>
+                  <w:r>
+                    <w:t xml:space="preserve">5.3 [4.0, 7.5]</w:t>
+                  </w:r>
+                </w:p>
+              </w:tc>
+              <w:tc>
+                <w:tcPr/>
+                <w:p>
+                  <w:pPr>
+                    <w:pStyle w:val="Compact"/>
+                    <w:jc w:val="left"/>
+                    <w:jc w:val="center"/>
+                  </w:pPr>
+                  <w:r>
+                    <w:t xml:space="preserve">0.66</w:t>
+                  </w:r>
+                </w:p>
+              </w:tc>
+            </w:tr>
+            <w:tr>
+              <w:tc>
+                <w:tcPr/>
+                <w:p>
+                  <w:pPr>
+                    <w:pStyle w:val="Compact"/>
+                    <w:jc w:val="left"/>
+                    <w:jc w:val="center"/>
+                  </w:pPr>
+                  <w:r>
+                    <w:t xml:space="preserve">TH</w:t>
+                  </w:r>
+                </w:p>
+              </w:tc>
+              <w:tc>
+                <w:tcPr/>
+                <w:p>
+                  <w:pPr>
+                    <w:pStyle w:val="Compact"/>
+                    <w:jc w:val="left"/>
+                    <w:jc w:val="center"/>
+                  </w:pPr>
+                  <w:r>
+                    <w:t xml:space="preserve">envcom</w:t>
+                  </w:r>
+                </w:p>
+              </w:tc>
+              <w:tc>
+                <w:tcPr/>
+                <w:p>
+                  <w:pPr>
+                    <w:pStyle w:val="Compact"/>
+                    <w:jc w:val="left"/>
+                    <w:jc w:val="center"/>
+                  </w:pPr>
+                  <w:r>
+                    <w:t xml:space="preserve">6.5 [4.7, 9.0]</w:t>
+                  </w:r>
+                </w:p>
+              </w:tc>
+              <w:tc>
+                <w:tcPr/>
+                <w:p>
+                  <w:pPr>
+                    <w:pStyle w:val="Compact"/>
+                    <w:jc w:val="left"/>
+                    <w:jc w:val="center"/>
+                  </w:pPr>
+                  <w:r>
+                    <w:t xml:space="preserve">0.81</w:t>
+                  </w:r>
+                </w:p>
+              </w:tc>
+            </w:tr>
+            <w:tr>
+              <w:tc>
+                <w:tcPr/>
+                <w:p>
+                  <w:pPr>
+                    <w:pStyle w:val="Compact"/>
+                    <w:jc w:val="left"/>
+                    <w:jc w:val="center"/>
+                  </w:pPr>
+                  <w:r>
+                    <w:t xml:space="preserve">TW</w:t>
+                  </w:r>
+                </w:p>
+              </w:tc>
+              <w:tc>
+                <w:tcPr/>
+                <w:p>
+                  <w:pPr>
+                    <w:pStyle w:val="Compact"/>
+                    <w:jc w:val="left"/>
+                    <w:jc w:val="center"/>
+                  </w:pPr>
+                  <w:r>
+                    <w:t xml:space="preserve">envcom</w:t>
+                  </w:r>
+                </w:p>
+              </w:tc>
+              <w:tc>
+                <w:tcPr/>
+                <w:p>
+                  <w:pPr>
+                    <w:pStyle w:val="Compact"/>
+                    <w:jc w:val="left"/>
+                    <w:jc w:val="center"/>
+                  </w:pPr>
+                  <w:r>
+                    <w:t xml:space="preserve">6.7 [5.1, 8.2]</w:t>
+                  </w:r>
+                </w:p>
+              </w:tc>
+              <w:tc>
+                <w:tcPr/>
+                <w:p>
+                  <w:pPr>
+                    <w:pStyle w:val="Compact"/>
+                    <w:jc w:val="left"/>
+                    <w:jc w:val="center"/>
+                  </w:pPr>
+                  <w:r>
+                    <w:t xml:space="preserve">0.88</w:t>
+                  </w:r>
+                </w:p>
+              </w:tc>
+            </w:tr>
+            <w:tr>
+              <w:tc>
+                <w:tcPr/>
+                <w:p>
+                  <w:pPr>
+                    <w:pStyle w:val="Compact"/>
+                    <w:jc w:val="left"/>
+                    <w:jc w:val="center"/>
+                  </w:pPr>
+                  <w:r>
+                    <w:t xml:space="preserve">US</w:t>
                   </w:r>
                 </w:p>
               </w:tc>
@@ -8440,35 +9258,35 @@
                     <w:jc w:val="center"/>
                   </w:pPr>
                   <w:r>
-                    <w:t xml:space="preserve">7.5 [5.8, 11.0]</w:t>
-                  </w:r>
-                </w:p>
-              </w:tc>
-              <w:tc>
-                <w:tcPr/>
-                <w:p>
-                  <w:pPr>
-                    <w:pStyle w:val="Compact"/>
-                    <w:jc w:val="left"/>
-                    <w:jc w:val="center"/>
-                  </w:pPr>
-                  <w:r>
-                    <w:t xml:space="preserve">0.98</w:t>
-                  </w:r>
-                </w:p>
-              </w:tc>
-            </w:tr>
-            <w:tr>
-              <w:tc>
-                <w:tcPr/>
-                <w:p>
-                  <w:pPr>
-                    <w:pStyle w:val="Compact"/>
-                    <w:jc w:val="left"/>
-                    <w:jc w:val="center"/>
-                  </w:pPr>
-                  <w:r>
-                    <w:t xml:space="preserve">IS</w:t>
+                    <w:t xml:space="preserve">6.1 [4.5, 6.8]</w:t>
+                  </w:r>
+                </w:p>
+              </w:tc>
+              <w:tc>
+                <w:tcPr/>
+                <w:p>
+                  <w:pPr>
+                    <w:pStyle w:val="Compact"/>
+                    <w:jc w:val="left"/>
+                    <w:jc w:val="center"/>
+                  </w:pPr>
+                  <w:r>
+                    <w:t xml:space="preserve">0.60</w:t>
+                  </w:r>
+                </w:p>
+              </w:tc>
+            </w:tr>
+            <w:tr>
+              <w:tc>
+                <w:tcPr/>
+                <w:p>
+                  <w:pPr>
+                    <w:pStyle w:val="Compact"/>
+                    <w:jc w:val="left"/>
+                    <w:jc w:val="center"/>
+                  </w:pPr>
+                  <w:r>
+                    <w:t xml:space="preserve">ZA</w:t>
                   </w:r>
                 </w:p>
               </w:tc>
@@ -8494,817 +9312,7 @@
                     <w:jc w:val="center"/>
                   </w:pPr>
                   <w:r>
-                    <w:t xml:space="preserve">5.9 [4.8, 7.4]</w:t>
-                  </w:r>
-                </w:p>
-              </w:tc>
-              <w:tc>
-                <w:tcPr/>
-                <w:p>
-                  <w:pPr>
-                    <w:pStyle w:val="Compact"/>
-                    <w:jc w:val="left"/>
-                    <w:jc w:val="center"/>
-                  </w:pPr>
-                  <w:r>
-                    <w:t xml:space="preserve">0.64</w:t>
-                  </w:r>
-                </w:p>
-              </w:tc>
-            </w:tr>
-            <w:tr>
-              <w:tc>
-                <w:tcPr/>
-                <w:p>
-                  <w:pPr>
-                    <w:pStyle w:val="Compact"/>
-                    <w:jc w:val="left"/>
-                    <w:jc w:val="center"/>
-                  </w:pPr>
-                  <w:r>
-                    <w:t xml:space="preserve">IT</w:t>
-                  </w:r>
-                </w:p>
-              </w:tc>
-              <w:tc>
-                <w:tcPr/>
-                <w:p>
-                  <w:pPr>
-                    <w:pStyle w:val="Compact"/>
-                    <w:jc w:val="left"/>
-                    <w:jc w:val="center"/>
-                  </w:pPr>
-                  <w:r>
-                    <w:t xml:space="preserve">envcom</w:t>
-                  </w:r>
-                </w:p>
-              </w:tc>
-              <w:tc>
-                <w:tcPr/>
-                <w:p>
-                  <w:pPr>
-                    <w:pStyle w:val="Compact"/>
-                    <w:jc w:val="left"/>
-                    <w:jc w:val="center"/>
-                  </w:pPr>
-                  <w:r>
-                    <w:t xml:space="preserve">3.2 [2.8, 3.8]</w:t>
-                  </w:r>
-                </w:p>
-              </w:tc>
-              <w:tc>
-                <w:tcPr/>
-                <w:p>
-                  <w:pPr>
-                    <w:pStyle w:val="Compact"/>
-                    <w:jc w:val="left"/>
-                    <w:jc w:val="center"/>
-                  </w:pPr>
-                  <w:r>
-                    <w:t xml:space="preserve">1.00</w:t>
-                  </w:r>
-                </w:p>
-              </w:tc>
-            </w:tr>
-            <w:tr>
-              <w:tc>
-                <w:tcPr/>
-                <w:p>
-                  <w:pPr>
-                    <w:pStyle w:val="Compact"/>
-                    <w:jc w:val="left"/>
-                    <w:jc w:val="center"/>
-                  </w:pPr>
-                  <w:r>
-                    <w:t xml:space="preserve">JP</w:t>
-                  </w:r>
-                </w:p>
-              </w:tc>
-              <w:tc>
-                <w:tcPr/>
-                <w:p>
-                  <w:pPr>
-                    <w:pStyle w:val="Compact"/>
-                    <w:jc w:val="left"/>
-                    <w:jc w:val="center"/>
-                  </w:pPr>
-                  <w:r>
-                    <w:t xml:space="preserve">envcom</w:t>
-                  </w:r>
-                </w:p>
-              </w:tc>
-              <w:tc>
-                <w:tcPr/>
-                <w:p>
-                  <w:pPr>
-                    <w:pStyle w:val="Compact"/>
-                    <w:jc w:val="left"/>
-                    <w:jc w:val="center"/>
-                  </w:pPr>
-                  <w:r>
-                    <w:t xml:space="preserve">4.7 [3.9, 6.9]</w:t>
-                  </w:r>
-                </w:p>
-              </w:tc>
-              <w:tc>
-                <w:tcPr/>
-                <w:p>
-                  <w:pPr>
-                    <w:pStyle w:val="Compact"/>
-                    <w:jc w:val="left"/>
-                    <w:jc w:val="center"/>
-                  </w:pPr>
-                  <w:r>
-                    <w:t xml:space="preserve">0.98</w:t>
-                  </w:r>
-                </w:p>
-              </w:tc>
-            </w:tr>
-            <w:tr>
-              <w:tc>
-                <w:tcPr/>
-                <w:p>
-                  <w:pPr>
-                    <w:pStyle w:val="Compact"/>
-                    <w:jc w:val="left"/>
-                    <w:jc w:val="center"/>
-                  </w:pPr>
-                  <w:r>
-                    <w:t xml:space="preserve">KR</w:t>
-                  </w:r>
-                </w:p>
-              </w:tc>
-              <w:tc>
-                <w:tcPr/>
-                <w:p>
-                  <w:pPr>
-                    <w:pStyle w:val="Compact"/>
-                    <w:jc w:val="left"/>
-                    <w:jc w:val="center"/>
-                  </w:pPr>
-                  <w:r>
-                    <w:t xml:space="preserve">envcom</w:t>
-                  </w:r>
-                </w:p>
-              </w:tc>
-              <w:tc>
-                <w:tcPr/>
-                <w:p>
-                  <w:pPr>
-                    <w:pStyle w:val="Compact"/>
-                    <w:jc w:val="left"/>
-                    <w:jc w:val="center"/>
-                  </w:pPr>
-                  <w:r>
-                    <w:t xml:space="preserve">7.0 [5.2, 10.3]</w:t>
-                  </w:r>
-                </w:p>
-              </w:tc>
-              <w:tc>
-                <w:tcPr/>
-                <w:p>
-                  <w:pPr>
-                    <w:pStyle w:val="Compact"/>
-                    <w:jc w:val="left"/>
-                    <w:jc w:val="center"/>
-                  </w:pPr>
-                  <w:r>
-                    <w:t xml:space="preserve">0.94</w:t>
-                  </w:r>
-                </w:p>
-              </w:tc>
-            </w:tr>
-            <w:tr>
-              <w:tc>
-                <w:tcPr/>
-                <w:p>
-                  <w:pPr>
-                    <w:pStyle w:val="Compact"/>
-                    <w:jc w:val="left"/>
-                    <w:jc w:val="center"/>
-                  </w:pPr>
-                  <w:r>
-                    <w:t xml:space="preserve">LT</w:t>
-                  </w:r>
-                </w:p>
-              </w:tc>
-              <w:tc>
-                <w:tcPr/>
-                <w:p>
-                  <w:pPr>
-                    <w:pStyle w:val="Compact"/>
-                    <w:jc w:val="left"/>
-                    <w:jc w:val="center"/>
-                  </w:pPr>
-                  <w:r>
-                    <w:t xml:space="preserve">envcom</w:t>
-                  </w:r>
-                </w:p>
-              </w:tc>
-              <w:tc>
-                <w:tcPr/>
-                <w:p>
-                  <w:pPr>
-                    <w:pStyle w:val="Compact"/>
-                    <w:jc w:val="left"/>
-                    <w:jc w:val="center"/>
-                  </w:pPr>
-                  <w:r>
-                    <w:t xml:space="preserve">3.7 [3.2, 4.7]</w:t>
-                  </w:r>
-                </w:p>
-              </w:tc>
-              <w:tc>
-                <w:tcPr/>
-                <w:p>
-                  <w:pPr>
-                    <w:pStyle w:val="Compact"/>
-                    <w:jc w:val="left"/>
-                    <w:jc w:val="center"/>
-                  </w:pPr>
-                  <w:r>
-                    <w:t xml:space="preserve">1.00</w:t>
-                  </w:r>
-                </w:p>
-              </w:tc>
-            </w:tr>
-            <w:tr>
-              <w:tc>
-                <w:tcPr/>
-                <w:p>
-                  <w:pPr>
-                    <w:pStyle w:val="Compact"/>
-                    <w:jc w:val="left"/>
-                    <w:jc w:val="center"/>
-                  </w:pPr>
-                  <w:r>
-                    <w:t xml:space="preserve">NO</w:t>
-                  </w:r>
-                </w:p>
-              </w:tc>
-              <w:tc>
-                <w:tcPr/>
-                <w:p>
-                  <w:pPr>
-                    <w:pStyle w:val="Compact"/>
-                    <w:jc w:val="left"/>
-                    <w:jc w:val="center"/>
-                  </w:pPr>
-                  <w:r>
-                    <w:t xml:space="preserve">envcom</w:t>
-                  </w:r>
-                </w:p>
-              </w:tc>
-              <w:tc>
-                <w:tcPr/>
-                <w:p>
-                  <w:pPr>
-                    <w:pStyle w:val="Compact"/>
-                    <w:jc w:val="left"/>
-                    <w:jc w:val="center"/>
-                  </w:pPr>
-                  <w:r>
-                    <w:t xml:space="preserve">5.1 [4.2, 6.6]</w:t>
-                  </w:r>
-                </w:p>
-              </w:tc>
-              <w:tc>
-                <w:tcPr/>
-                <w:p>
-                  <w:pPr>
-                    <w:pStyle w:val="Compact"/>
-                    <w:jc w:val="left"/>
-                    <w:jc w:val="center"/>
-                  </w:pPr>
-                  <w:r>
-                    <w:t xml:space="preserve">0.96</w:t>
-                  </w:r>
-                </w:p>
-              </w:tc>
-            </w:tr>
-            <w:tr>
-              <w:tc>
-                <w:tcPr/>
-                <w:p>
-                  <w:pPr>
-                    <w:pStyle w:val="Compact"/>
-                    <w:jc w:val="left"/>
-                    <w:jc w:val="center"/>
-                  </w:pPr>
-                  <w:r>
-                    <w:t xml:space="preserve">NZ</w:t>
-                  </w:r>
-                </w:p>
-              </w:tc>
-              <w:tc>
-                <w:tcPr/>
-                <w:p>
-                  <w:pPr>
-                    <w:pStyle w:val="Compact"/>
-                    <w:jc w:val="left"/>
-                    <w:jc w:val="center"/>
-                  </w:pPr>
-                  <w:r>
-                    <w:t xml:space="preserve">envcom</w:t>
-                  </w:r>
-                </w:p>
-              </w:tc>
-              <w:tc>
-                <w:tcPr/>
-                <w:p>
-                  <w:pPr>
-                    <w:pStyle w:val="Compact"/>
-                    <w:jc w:val="left"/>
-                    <w:jc w:val="center"/>
-                  </w:pPr>
-                  <w:r>
-                    <w:t xml:space="preserve">5.5 [4.4, 7.6]</w:t>
-                  </w:r>
-                </w:p>
-              </w:tc>
-              <w:tc>
-                <w:tcPr/>
-                <w:p>
-                  <w:pPr>
-                    <w:pStyle w:val="Compact"/>
-                    <w:jc w:val="left"/>
-                    <w:jc w:val="center"/>
-                  </w:pPr>
-                  <w:r>
-                    <w:t xml:space="preserve">0.76</w:t>
-                  </w:r>
-                </w:p>
-              </w:tc>
-            </w:tr>
-            <w:tr>
-              <w:tc>
-                <w:tcPr/>
-                <w:p>
-                  <w:pPr>
-                    <w:pStyle w:val="Compact"/>
-                    <w:jc w:val="left"/>
-                    <w:jc w:val="center"/>
-                  </w:pPr>
-                  <w:r>
-                    <w:t xml:space="preserve">PH</w:t>
-                  </w:r>
-                </w:p>
-              </w:tc>
-              <w:tc>
-                <w:tcPr/>
-                <w:p>
-                  <w:pPr>
-                    <w:pStyle w:val="Compact"/>
-                    <w:jc w:val="left"/>
-                    <w:jc w:val="center"/>
-                  </w:pPr>
-                  <w:r>
-                    <w:t xml:space="preserve">nature</w:t>
-                  </w:r>
-                </w:p>
-              </w:tc>
-              <w:tc>
-                <w:tcPr/>
-                <w:p>
-                  <w:pPr>
-                    <w:pStyle w:val="Compact"/>
-                    <w:jc w:val="left"/>
-                    <w:jc w:val="center"/>
-                  </w:pPr>
-                  <w:r>
-                    <w:t xml:space="preserve">10.3 [7.4, 20.2]</w:t>
-                  </w:r>
-                </w:p>
-              </w:tc>
-              <w:tc>
-                <w:tcPr/>
-                <w:p>
-                  <w:pPr>
-                    <w:pStyle w:val="Compact"/>
-                    <w:jc w:val="left"/>
-                    <w:jc w:val="center"/>
-                  </w:pPr>
-                  <w:r>
-                    <w:t xml:space="preserve">0.74</w:t>
-                  </w:r>
-                </w:p>
-              </w:tc>
-            </w:tr>
-            <w:tr>
-              <w:tc>
-                <w:tcPr/>
-                <w:p>
-                  <w:pPr>
-                    <w:pStyle w:val="Compact"/>
-                    <w:jc w:val="left"/>
-                    <w:jc w:val="center"/>
-                  </w:pPr>
-                  <w:r>
-                    <w:t xml:space="preserve">RU</w:t>
-                  </w:r>
-                </w:p>
-              </w:tc>
-              <w:tc>
-                <w:tcPr/>
-                <w:p>
-                  <w:pPr>
-                    <w:pStyle w:val="Compact"/>
-                    <w:jc w:val="left"/>
-                    <w:jc w:val="center"/>
-                  </w:pPr>
-                  <w:r>
-                    <w:t xml:space="preserve">envcom</w:t>
-                  </w:r>
-                </w:p>
-              </w:tc>
-              <w:tc>
-                <w:tcPr/>
-                <w:p>
-                  <w:pPr>
-                    <w:pStyle w:val="Compact"/>
-                    <w:jc w:val="left"/>
-                    <w:jc w:val="center"/>
-                  </w:pPr>
-                  <w:r>
-                    <w:t xml:space="preserve">4.5 [3.9, 5.9]</w:t>
-                  </w:r>
-                </w:p>
-              </w:tc>
-              <w:tc>
-                <w:tcPr/>
-                <w:p>
-                  <w:pPr>
-                    <w:pStyle w:val="Compact"/>
-                    <w:jc w:val="left"/>
-                    <w:jc w:val="center"/>
-                  </w:pPr>
-                  <w:r>
-                    <w:t xml:space="preserve">1.00</w:t>
-                  </w:r>
-                </w:p>
-              </w:tc>
-            </w:tr>
-            <w:tr>
-              <w:tc>
-                <w:tcPr/>
-                <w:p>
-                  <w:pPr>
-                    <w:pStyle w:val="Compact"/>
-                    <w:jc w:val="left"/>
-                    <w:jc w:val="center"/>
-                  </w:pPr>
-                  <w:r>
-                    <w:t xml:space="preserve">SE</w:t>
-                  </w:r>
-                </w:p>
-              </w:tc>
-              <w:tc>
-                <w:tcPr/>
-                <w:p>
-                  <w:pPr>
-                    <w:pStyle w:val="Compact"/>
-                    <w:jc w:val="left"/>
-                    <w:jc w:val="center"/>
-                  </w:pPr>
-                  <w:r>
-                    <w:t xml:space="preserve">envcom</w:t>
-                  </w:r>
-                </w:p>
-              </w:tc>
-              <w:tc>
-                <w:tcPr/>
-                <w:p>
-                  <w:pPr>
-                    <w:pStyle w:val="Compact"/>
-                    <w:jc w:val="left"/>
-                    <w:jc w:val="center"/>
-                  </w:pPr>
-                  <w:r>
-                    <w:t xml:space="preserve">5.3 [4.6, 6.6]</w:t>
-                  </w:r>
-                </w:p>
-              </w:tc>
-              <w:tc>
-                <w:tcPr/>
-                <w:p>
-                  <w:pPr>
-                    <w:pStyle w:val="Compact"/>
-                    <w:jc w:val="left"/>
-                    <w:jc w:val="center"/>
-                  </w:pPr>
-                  <w:r>
-                    <w:t xml:space="preserve">0.96</w:t>
-                  </w:r>
-                </w:p>
-              </w:tc>
-            </w:tr>
-            <w:tr>
-              <w:tc>
-                <w:tcPr/>
-                <w:p>
-                  <w:pPr>
-                    <w:pStyle w:val="Compact"/>
-                    <w:jc w:val="left"/>
-                    <w:jc w:val="center"/>
-                  </w:pPr>
-                  <w:r>
-                    <w:t xml:space="preserve">SI</w:t>
-                  </w:r>
-                </w:p>
-              </w:tc>
-              <w:tc>
-                <w:tcPr/>
-                <w:p>
-                  <w:pPr>
-                    <w:pStyle w:val="Compact"/>
-                    <w:jc w:val="left"/>
-                    <w:jc w:val="center"/>
-                  </w:pPr>
-                  <w:r>
-                    <w:t xml:space="preserve">envcom</w:t>
-                  </w:r>
-                </w:p>
-              </w:tc>
-              <w:tc>
-                <w:tcPr/>
-                <w:p>
-                  <w:pPr>
-                    <w:pStyle w:val="Compact"/>
-                    <w:jc w:val="left"/>
-                    <w:jc w:val="center"/>
-                  </w:pPr>
-                  <w:r>
-                    <w:t xml:space="preserve">4.7 [3.8, 6.5]</w:t>
-                  </w:r>
-                </w:p>
-              </w:tc>
-              <w:tc>
-                <w:tcPr/>
-                <w:p>
-                  <w:pPr>
-                    <w:pStyle w:val="Compact"/>
-                    <w:jc w:val="left"/>
-                    <w:jc w:val="center"/>
-                  </w:pPr>
-                  <w:r>
-                    <w:t xml:space="preserve">1.00</w:t>
-                  </w:r>
-                </w:p>
-              </w:tc>
-            </w:tr>
-            <w:tr>
-              <w:tc>
-                <w:tcPr/>
-                <w:p>
-                  <w:pPr>
-                    <w:pStyle w:val="Compact"/>
-                    <w:jc w:val="left"/>
-                    <w:jc w:val="center"/>
-                  </w:pPr>
-                  <w:r>
-                    <w:t xml:space="preserve">SK</w:t>
-                  </w:r>
-                </w:p>
-              </w:tc>
-              <w:tc>
-                <w:tcPr/>
-                <w:p>
-                  <w:pPr>
-                    <w:pStyle w:val="Compact"/>
-                    <w:jc w:val="left"/>
-                    <w:jc w:val="center"/>
-                  </w:pPr>
-                  <w:r>
-                    <w:t xml:space="preserve">envcom</w:t>
-                  </w:r>
-                </w:p>
-              </w:tc>
-              <w:tc>
-                <w:tcPr/>
-                <w:p>
-                  <w:pPr>
-                    <w:pStyle w:val="Compact"/>
-                    <w:jc w:val="left"/>
-                    <w:jc w:val="center"/>
-                  </w:pPr>
-                  <w:r>
-                    <w:t xml:space="preserve">5.2 [3.9, 7.4]</w:t>
-                  </w:r>
-                </w:p>
-              </w:tc>
-              <w:tc>
-                <w:tcPr/>
-                <w:p>
-                  <w:pPr>
-                    <w:pStyle w:val="Compact"/>
-                    <w:jc w:val="left"/>
-                    <w:jc w:val="center"/>
-                  </w:pPr>
-                  <w:r>
-                    <w:t xml:space="preserve">0.68</w:t>
-                  </w:r>
-                </w:p>
-              </w:tc>
-            </w:tr>
-            <w:tr>
-              <w:tc>
-                <w:tcPr/>
-                <w:p>
-                  <w:pPr>
-                    <w:pStyle w:val="Compact"/>
-                    <w:jc w:val="left"/>
-                    <w:jc w:val="center"/>
-                  </w:pPr>
-                  <w:r>
-                    <w:t xml:space="preserve">TH</w:t>
-                  </w:r>
-                </w:p>
-              </w:tc>
-              <w:tc>
-                <w:tcPr/>
-                <w:p>
-                  <w:pPr>
-                    <w:pStyle w:val="Compact"/>
-                    <w:jc w:val="left"/>
-                    <w:jc w:val="center"/>
-                  </w:pPr>
-                  <w:r>
-                    <w:t xml:space="preserve">envcom</w:t>
-                  </w:r>
-                </w:p>
-              </w:tc>
-              <w:tc>
-                <w:tcPr/>
-                <w:p>
-                  <w:pPr>
-                    <w:pStyle w:val="Compact"/>
-                    <w:jc w:val="left"/>
-                    <w:jc w:val="center"/>
-                  </w:pPr>
-                  <w:r>
-                    <w:t xml:space="preserve">6.6 [4.6, 8.7]</w:t>
-                  </w:r>
-                </w:p>
-              </w:tc>
-              <w:tc>
-                <w:tcPr/>
-                <w:p>
-                  <w:pPr>
-                    <w:pStyle w:val="Compact"/>
-                    <w:jc w:val="left"/>
-                    <w:jc w:val="center"/>
-                  </w:pPr>
-                  <w:r>
-                    <w:t xml:space="preserve">0.78</w:t>
-                  </w:r>
-                </w:p>
-              </w:tc>
-            </w:tr>
-            <w:tr>
-              <w:tc>
-                <w:tcPr/>
-                <w:p>
-                  <w:pPr>
-                    <w:pStyle w:val="Compact"/>
-                    <w:jc w:val="left"/>
-                    <w:jc w:val="center"/>
-                  </w:pPr>
-                  <w:r>
-                    <w:t xml:space="preserve">TW</w:t>
-                  </w:r>
-                </w:p>
-              </w:tc>
-              <w:tc>
-                <w:tcPr/>
-                <w:p>
-                  <w:pPr>
-                    <w:pStyle w:val="Compact"/>
-                    <w:jc w:val="left"/>
-                    <w:jc w:val="center"/>
-                  </w:pPr>
-                  <w:r>
-                    <w:t xml:space="preserve">envcom</w:t>
-                  </w:r>
-                </w:p>
-              </w:tc>
-              <w:tc>
-                <w:tcPr/>
-                <w:p>
-                  <w:pPr>
-                    <w:pStyle w:val="Compact"/>
-                    <w:jc w:val="left"/>
-                    <w:jc w:val="center"/>
-                  </w:pPr>
-                  <w:r>
-                    <w:t xml:space="preserve">6.2 [5.0, 7.8]</w:t>
-                  </w:r>
-                </w:p>
-              </w:tc>
-              <w:tc>
-                <w:tcPr/>
-                <w:p>
-                  <w:pPr>
-                    <w:pStyle w:val="Compact"/>
-                    <w:jc w:val="left"/>
-                    <w:jc w:val="center"/>
-                  </w:pPr>
-                  <w:r>
-                    <w:t xml:space="preserve">0.80</w:t>
-                  </w:r>
-                </w:p>
-              </w:tc>
-            </w:tr>
-            <w:tr>
-              <w:tc>
-                <w:tcPr/>
-                <w:p>
-                  <w:pPr>
-                    <w:pStyle w:val="Compact"/>
-                    <w:jc w:val="left"/>
-                    <w:jc w:val="center"/>
-                  </w:pPr>
-                  <w:r>
-                    <w:t xml:space="preserve">US</w:t>
-                  </w:r>
-                </w:p>
-              </w:tc>
-              <w:tc>
-                <w:tcPr/>
-                <w:p>
-                  <w:pPr>
-                    <w:pStyle w:val="Compact"/>
-                    <w:jc w:val="left"/>
-                    <w:jc w:val="center"/>
-                  </w:pPr>
-                  <w:r>
-                    <w:t xml:space="preserve">nature</w:t>
-                  </w:r>
-                </w:p>
-              </w:tc>
-              <w:tc>
-                <w:tcPr/>
-                <w:p>
-                  <w:pPr>
-                    <w:pStyle w:val="Compact"/>
-                    <w:jc w:val="left"/>
-                    <w:jc w:val="center"/>
-                  </w:pPr>
-                  <w:r>
-                    <w:t xml:space="preserve">6.0 [4.6, 6.9]</w:t>
-                  </w:r>
-                </w:p>
-              </w:tc>
-              <w:tc>
-                <w:tcPr/>
-                <w:p>
-                  <w:pPr>
-                    <w:pStyle w:val="Compact"/>
-                    <w:jc w:val="left"/>
-                    <w:jc w:val="center"/>
-                  </w:pPr>
-                  <w:r>
-                    <w:t xml:space="preserve">0.47</w:t>
-                  </w:r>
-                </w:p>
-              </w:tc>
-            </w:tr>
-            <w:tr>
-              <w:tc>
-                <w:tcPr/>
-                <w:p>
-                  <w:pPr>
-                    <w:pStyle w:val="Compact"/>
-                    <w:jc w:val="left"/>
-                    <w:jc w:val="center"/>
-                  </w:pPr>
-                  <w:r>
-                    <w:t xml:space="preserve">ZA</w:t>
-                  </w:r>
-                </w:p>
-              </w:tc>
-              <w:tc>
-                <w:tcPr/>
-                <w:p>
-                  <w:pPr>
-                    <w:pStyle w:val="Compact"/>
-                    <w:jc w:val="left"/>
-                    <w:jc w:val="center"/>
-                  </w:pPr>
-                  <w:r>
-                    <w:t xml:space="preserve">envcom</w:t>
-                  </w:r>
-                </w:p>
-              </w:tc>
-              <w:tc>
-                <w:tcPr/>
-                <w:p>
-                  <w:pPr>
-                    <w:pStyle w:val="Compact"/>
-                    <w:jc w:val="left"/>
-                    <w:jc w:val="center"/>
-                  </w:pPr>
-                  <w:r>
-                    <w:t xml:space="preserve">4.7 [4.1, 5.5]</w:t>
+                    <w:t xml:space="preserve">4.8 [4.2, 5.7]</w:t>
                   </w:r>
                 </w:p>
               </w:tc>

</xml_diff>

<commit_message>
Split environmental commitment into three nodes; add measures table
- Replace the EGA envcom node with willingness to sacrifice (v26-v28, v31),
  environmental concern (v15), and personal impact (v36); 9 belief nodes.
  Re-run all 28 country networks with fresh bootstraps
- willing (mean rank 2.25) and concern (2.61) sit closest to behavior;
  impact and threat are peripheral; rank-1 belief bootstrap-supported in 25/28
- Add belief measures table (ISSP wording, pooled alpha) to Data and Measures
- Rewrite measures and Results prose for the new node set; ties named in text
  and table caption
- Supplement: explain the split in S2, readable labels in S3
- Update LOG (Session 15) and README

Co-Authored-By: Claude Opus 5.5 <noreply@anthropic.com>
</commit_message>
<xml_diff>
--- a/_output/environ-beliefs-supplement.docx
+++ b/_output/environ-beliefs-supplement.docx
@@ -4684,6 +4684,14 @@
         <w:pStyle w:val="BodyText"/>
       </w:pPr>
       <w:r>
+        <w:t xml:space="preserve">In the manuscript I divide the environmental commitment scale into three measures. The willingness items, paying much higher prices, paying much higher taxes, and accepting cuts in one’s standard of living to protect the environment, along with doing what is right even when it costs more money and time, describe an intention to act rather than a belief about the environment. Willingness to sacrifice is the mean of the four willingness items (α = 0.78). The remaining two items, concern about environmental issues and the view that environmental problems have a direct effect on everyday life, are only modestly related (α = .41 as a pair), so each enters the network as a single-item node. The other three scales are unchanged.</w:t>
+      </w:r>
+    </w:p>
+    <w:p>
+      <w:pPr>
+        <w:pStyle w:val="BodyText"/>
+      </w:pPr>
+      <w:r>
         <w:t xml:space="preserve">For the behavior side, exploratory graph analysis of the six ISSP behavior items recovers 2 communities that match the public and private distinction used in Study 1. Recycling and product avoidance form one community, and group membership, petitions, donations, and protest form the other.</w:t>
       </w:r>
     </w:p>
@@ -7694,13 +7702,13 @@
       </w:r>
     </w:p>
     <w:bookmarkEnd w:id="22"/>
-    <w:bookmarkStart w:id="24" w:name="X0a9904803f6846e21642ac706a006834c7f1fb3"/>
+    <w:bookmarkStart w:id="24" w:name="X2bede0af59b1165b985d6c0862abb966749ba4c"/>
     <w:p>
       <w:pPr>
         <w:pStyle w:val="Heading1"/>
       </w:pPr>
       <w:r>
-        <w:t xml:space="preserve">S3. Study 2 belief-to-behavior distances by country</w:t>
+        <w:t xml:space="preserve">S3. Belief-to-behavior distances by country</w:t>
       </w:r>
     </w:p>
     <w:p>
@@ -7719,7 +7727,7 @@
         <w:t xml:space="preserve"> </w:t>
       </w:r>
       <w:r>
-        <w:t xml:space="preserve">reports, for each country, the belief with the shortest mean path to the behavior set and its 95 percent bootstrap interval, along with the proportion of 1,000 resamples in which that belief is the closest. A support value near 1 means the ordering is stable, and a value near one fifth means it is close to a coin flip.</w:t>
+        <w:t xml:space="preserve">reports, for each country, the belief with the shortest mean path to the behavior set and its 95 percent bootstrap interval, along with the proportion of 1,000 resamples in which that belief is the closest. A support value near 1 means the ordering is stable, and a value near one ninth, with nine beliefs, means it is close to a coin flip. Where two beliefs tie for closest, the table shows the one with more bootstrap support.</w:t>
       </w:r>
     </w:p>
     <w:tbl>
@@ -7841,20 +7849,128 @@
                     <w:jc w:val="center"/>
                   </w:pPr>
                   <w:r>
-                    <w:t xml:space="preserve">envcom</w:t>
-                  </w:r>
-                </w:p>
-              </w:tc>
-              <w:tc>
-                <w:tcPr/>
-                <w:p>
-                  <w:pPr>
-                    <w:pStyle w:val="Compact"/>
-                    <w:jc w:val="left"/>
-                    <w:jc w:val="center"/>
-                  </w:pPr>
-                  <w:r>
-                    <w:t xml:space="preserve">4.4 [3.7, 5.8]</w:t>
+                    <w:t xml:space="preserve">Willingness to sacrifice</w:t>
+                  </w:r>
+                </w:p>
+              </w:tc>
+              <w:tc>
+                <w:tcPr/>
+                <w:p>
+                  <w:pPr>
+                    <w:pStyle w:val="Compact"/>
+                    <w:jc w:val="left"/>
+                    <w:jc w:val="center"/>
+                  </w:pPr>
+                  <w:r>
+                    <w:t xml:space="preserve">5.8 [4.6, 7.7]</w:t>
+                  </w:r>
+                </w:p>
+              </w:tc>
+              <w:tc>
+                <w:tcPr/>
+                <w:p>
+                  <w:pPr>
+                    <w:pStyle w:val="Compact"/>
+                    <w:jc w:val="left"/>
+                    <w:jc w:val="center"/>
+                  </w:pPr>
+                  <w:r>
+                    <w:t xml:space="preserve">0.77</w:t>
+                  </w:r>
+                </w:p>
+              </w:tc>
+            </w:tr>
+            <w:tr>
+              <w:tc>
+                <w:tcPr/>
+                <w:p>
+                  <w:pPr>
+                    <w:pStyle w:val="Compact"/>
+                    <w:jc w:val="left"/>
+                    <w:jc w:val="center"/>
+                  </w:pPr>
+                  <w:r>
+                    <w:t xml:space="preserve">AU</w:t>
+                  </w:r>
+                </w:p>
+              </w:tc>
+              <w:tc>
+                <w:tcPr/>
+                <w:p>
+                  <w:pPr>
+                    <w:pStyle w:val="Compact"/>
+                    <w:jc w:val="left"/>
+                    <w:jc w:val="center"/>
+                  </w:pPr>
+                  <w:r>
+                    <w:t xml:space="preserve">Environmental concern</w:t>
+                  </w:r>
+                </w:p>
+              </w:tc>
+              <w:tc>
+                <w:tcPr/>
+                <w:p>
+                  <w:pPr>
+                    <w:pStyle w:val="Compact"/>
+                    <w:jc w:val="left"/>
+                    <w:jc w:val="center"/>
+                  </w:pPr>
+                  <w:r>
+                    <w:t xml:space="preserve">7.2 [5.0, 9.6]</w:t>
+                  </w:r>
+                </w:p>
+              </w:tc>
+              <w:tc>
+                <w:tcPr/>
+                <w:p>
+                  <w:pPr>
+                    <w:pStyle w:val="Compact"/>
+                    <w:jc w:val="left"/>
+                    <w:jc w:val="center"/>
+                  </w:pPr>
+                  <w:r>
+                    <w:t xml:space="preserve">0.55</w:t>
+                  </w:r>
+                </w:p>
+              </w:tc>
+            </w:tr>
+            <w:tr>
+              <w:tc>
+                <w:tcPr/>
+                <w:p>
+                  <w:pPr>
+                    <w:pStyle w:val="Compact"/>
+                    <w:jc w:val="left"/>
+                    <w:jc w:val="center"/>
+                  </w:pPr>
+                  <w:r>
+                    <w:t xml:space="preserve">CH</w:t>
+                  </w:r>
+                </w:p>
+              </w:tc>
+              <w:tc>
+                <w:tcPr/>
+                <w:p>
+                  <w:pPr>
+                    <w:pStyle w:val="Compact"/>
+                    <w:jc w:val="left"/>
+                    <w:jc w:val="center"/>
+                  </w:pPr>
+                  <w:r>
+                    <w:t xml:space="preserve">Willingness to sacrifice</w:t>
+                  </w:r>
+                </w:p>
+              </w:tc>
+              <w:tc>
+                <w:tcPr/>
+                <w:p>
+                  <w:pPr>
+                    <w:pStyle w:val="Compact"/>
+                    <w:jc w:val="left"/>
+                    <w:jc w:val="center"/>
+                  </w:pPr>
+                  <w:r>
+                    <w:t xml:space="preserve">6.7 [5.7, 8.2]</w:t>
                   </w:r>
                 </w:p>
               </w:tc>
@@ -7882,87 +7998,411 @@
                     <w:jc w:val="center"/>
                   </w:pPr>
                   <w:r>
-                    <w:t xml:space="preserve">AU</w:t>
-                  </w:r>
-                </w:p>
-              </w:tc>
-              <w:tc>
-                <w:tcPr/>
-                <w:p>
-                  <w:pPr>
-                    <w:pStyle w:val="Compact"/>
-                    <w:jc w:val="left"/>
-                    <w:jc w:val="center"/>
-                  </w:pPr>
-                  <w:r>
-                    <w:t xml:space="preserve">left_right</w:t>
-                  </w:r>
-                </w:p>
-              </w:tc>
-              <w:tc>
-                <w:tcPr/>
-                <w:p>
-                  <w:pPr>
-                    <w:pStyle w:val="Compact"/>
-                    <w:jc w:val="left"/>
-                    <w:jc w:val="center"/>
-                  </w:pPr>
-                  <w:r>
-                    <w:t xml:space="preserve">6.6 [5.0, 9.8]</w:t>
-                  </w:r>
-                </w:p>
-              </w:tc>
-              <w:tc>
-                <w:tcPr/>
-                <w:p>
-                  <w:pPr>
-                    <w:pStyle w:val="Compact"/>
-                    <w:jc w:val="left"/>
-                    <w:jc w:val="center"/>
-                  </w:pPr>
-                  <w:r>
-                    <w:t xml:space="preserve">0.35</w:t>
-                  </w:r>
-                </w:p>
-              </w:tc>
-            </w:tr>
-            <w:tr>
-              <w:tc>
-                <w:tcPr/>
-                <w:p>
-                  <w:pPr>
-                    <w:pStyle w:val="Compact"/>
-                    <w:jc w:val="left"/>
-                    <w:jc w:val="center"/>
-                  </w:pPr>
-                  <w:r>
-                    <w:t xml:space="preserve">CH</w:t>
-                  </w:r>
-                </w:p>
-              </w:tc>
-              <w:tc>
-                <w:tcPr/>
-                <w:p>
-                  <w:pPr>
-                    <w:pStyle w:val="Compact"/>
-                    <w:jc w:val="left"/>
-                    <w:jc w:val="center"/>
-                  </w:pPr>
-                  <w:r>
-                    <w:t xml:space="preserve">envcom</w:t>
-                  </w:r>
-                </w:p>
-              </w:tc>
-              <w:tc>
-                <w:tcPr/>
-                <w:p>
-                  <w:pPr>
-                    <w:pStyle w:val="Compact"/>
-                    <w:jc w:val="left"/>
-                    <w:jc w:val="center"/>
-                  </w:pPr>
-                  <w:r>
-                    <w:t xml:space="preserve">4.8 [4.3, 5.4]</w:t>
+                    <w:t xml:space="preserve">CN</w:t>
+                  </w:r>
+                </w:p>
+              </w:tc>
+              <w:tc>
+                <w:tcPr/>
+                <w:p>
+                  <w:pPr>
+                    <w:pStyle w:val="Compact"/>
+                    <w:jc w:val="left"/>
+                    <w:jc w:val="center"/>
+                  </w:pPr>
+                  <w:r>
+                    <w:t xml:space="preserve">Willingness to sacrifice</w:t>
+                  </w:r>
+                </w:p>
+              </w:tc>
+              <w:tc>
+                <w:tcPr/>
+                <w:p>
+                  <w:pPr>
+                    <w:pStyle w:val="Compact"/>
+                    <w:jc w:val="left"/>
+                    <w:jc w:val="center"/>
+                  </w:pPr>
+                  <w:r>
+                    <w:t xml:space="preserve">6.8 [5.7, 8.6]</w:t>
+                  </w:r>
+                </w:p>
+              </w:tc>
+              <w:tc>
+                <w:tcPr/>
+                <w:p>
+                  <w:pPr>
+                    <w:pStyle w:val="Compact"/>
+                    <w:jc w:val="left"/>
+                    <w:jc w:val="center"/>
+                  </w:pPr>
+                  <w:r>
+                    <w:t xml:space="preserve">0.91</w:t>
+                  </w:r>
+                </w:p>
+              </w:tc>
+            </w:tr>
+            <w:tr>
+              <w:tc>
+                <w:tcPr/>
+                <w:p>
+                  <w:pPr>
+                    <w:pStyle w:val="Compact"/>
+                    <w:jc w:val="left"/>
+                    <w:jc w:val="center"/>
+                  </w:pPr>
+                  <w:r>
+                    <w:t xml:space="preserve">DE</w:t>
+                  </w:r>
+                </w:p>
+              </w:tc>
+              <w:tc>
+                <w:tcPr/>
+                <w:p>
+                  <w:pPr>
+                    <w:pStyle w:val="Compact"/>
+                    <w:jc w:val="left"/>
+                    <w:jc w:val="center"/>
+                  </w:pPr>
+                  <w:r>
+                    <w:t xml:space="preserve">Willingness to sacrifice</w:t>
+                  </w:r>
+                </w:p>
+              </w:tc>
+              <w:tc>
+                <w:tcPr/>
+                <w:p>
+                  <w:pPr>
+                    <w:pStyle w:val="Compact"/>
+                    <w:jc w:val="left"/>
+                    <w:jc w:val="center"/>
+                  </w:pPr>
+                  <w:r>
+                    <w:t xml:space="preserve">7.6 [6.0, 10.2]</w:t>
+                  </w:r>
+                </w:p>
+              </w:tc>
+              <w:tc>
+                <w:tcPr/>
+                <w:p>
+                  <w:pPr>
+                    <w:pStyle w:val="Compact"/>
+                    <w:jc w:val="left"/>
+                    <w:jc w:val="center"/>
+                  </w:pPr>
+                  <w:r>
+                    <w:t xml:space="preserve">0.74</w:t>
+                  </w:r>
+                </w:p>
+              </w:tc>
+            </w:tr>
+            <w:tr>
+              <w:tc>
+                <w:tcPr/>
+                <w:p>
+                  <w:pPr>
+                    <w:pStyle w:val="Compact"/>
+                    <w:jc w:val="left"/>
+                    <w:jc w:val="center"/>
+                  </w:pPr>
+                  <w:r>
+                    <w:t xml:space="preserve">DK</w:t>
+                  </w:r>
+                </w:p>
+              </w:tc>
+              <w:tc>
+                <w:tcPr/>
+                <w:p>
+                  <w:pPr>
+                    <w:pStyle w:val="Compact"/>
+                    <w:jc w:val="left"/>
+                    <w:jc w:val="center"/>
+                  </w:pPr>
+                  <w:r>
+                    <w:t xml:space="preserve">Willingness to sacrifice</w:t>
+                  </w:r>
+                </w:p>
+              </w:tc>
+              <w:tc>
+                <w:tcPr/>
+                <w:p>
+                  <w:pPr>
+                    <w:pStyle w:val="Compact"/>
+                    <w:jc w:val="left"/>
+                    <w:jc w:val="center"/>
+                  </w:pPr>
+                  <w:r>
+                    <w:t xml:space="preserve">6.9 [5.0, 7.7]</w:t>
+                  </w:r>
+                </w:p>
+              </w:tc>
+              <w:tc>
+                <w:tcPr/>
+                <w:p>
+                  <w:pPr>
+                    <w:pStyle w:val="Compact"/>
+                    <w:jc w:val="left"/>
+                    <w:jc w:val="center"/>
+                  </w:pPr>
+                  <w:r>
+                    <w:t xml:space="preserve">0.64</w:t>
+                  </w:r>
+                </w:p>
+              </w:tc>
+            </w:tr>
+            <w:tr>
+              <w:tc>
+                <w:tcPr/>
+                <w:p>
+                  <w:pPr>
+                    <w:pStyle w:val="Compact"/>
+                    <w:jc w:val="left"/>
+                    <w:jc w:val="center"/>
+                  </w:pPr>
+                  <w:r>
+                    <w:t xml:space="preserve">ES</w:t>
+                  </w:r>
+                </w:p>
+              </w:tc>
+              <w:tc>
+                <w:tcPr/>
+                <w:p>
+                  <w:pPr>
+                    <w:pStyle w:val="Compact"/>
+                    <w:jc w:val="left"/>
+                    <w:jc w:val="center"/>
+                  </w:pPr>
+                  <w:r>
+                    <w:t xml:space="preserve">Environmental concern</w:t>
+                  </w:r>
+                </w:p>
+              </w:tc>
+              <w:tc>
+                <w:tcPr/>
+                <w:p>
+                  <w:pPr>
+                    <w:pStyle w:val="Compact"/>
+                    <w:jc w:val="left"/>
+                    <w:jc w:val="center"/>
+                  </w:pPr>
+                  <w:r>
+                    <w:t xml:space="preserve">6.7 [5.6, 8.4]</w:t>
+                  </w:r>
+                </w:p>
+              </w:tc>
+              <w:tc>
+                <w:tcPr/>
+                <w:p>
+                  <w:pPr>
+                    <w:pStyle w:val="Compact"/>
+                    <w:jc w:val="left"/>
+                    <w:jc w:val="center"/>
+                  </w:pPr>
+                  <w:r>
+                    <w:t xml:space="preserve">0.95</w:t>
+                  </w:r>
+                </w:p>
+              </w:tc>
+            </w:tr>
+            <w:tr>
+              <w:tc>
+                <w:tcPr/>
+                <w:p>
+                  <w:pPr>
+                    <w:pStyle w:val="Compact"/>
+                    <w:jc w:val="left"/>
+                    <w:jc w:val="center"/>
+                  </w:pPr>
+                  <w:r>
+                    <w:t xml:space="preserve">FI</w:t>
+                  </w:r>
+                </w:p>
+              </w:tc>
+              <w:tc>
+                <w:tcPr/>
+                <w:p>
+                  <w:pPr>
+                    <w:pStyle w:val="Compact"/>
+                    <w:jc w:val="left"/>
+                    <w:jc w:val="center"/>
+                  </w:pPr>
+                  <w:r>
+                    <w:t xml:space="preserve">Willingness to sacrifice</w:t>
+                  </w:r>
+                </w:p>
+              </w:tc>
+              <w:tc>
+                <w:tcPr/>
+                <w:p>
+                  <w:pPr>
+                    <w:pStyle w:val="Compact"/>
+                    <w:jc w:val="left"/>
+                    <w:jc w:val="center"/>
+                  </w:pPr>
+                  <w:r>
+                    <w:t xml:space="preserve">6.4 [5.7, 8.1]</w:t>
+                  </w:r>
+                </w:p>
+              </w:tc>
+              <w:tc>
+                <w:tcPr/>
+                <w:p>
+                  <w:pPr>
+                    <w:pStyle w:val="Compact"/>
+                    <w:jc w:val="left"/>
+                    <w:jc w:val="center"/>
+                  </w:pPr>
+                  <w:r>
+                    <w:t xml:space="preserve">0.55</w:t>
+                  </w:r>
+                </w:p>
+              </w:tc>
+            </w:tr>
+            <w:tr>
+              <w:tc>
+                <w:tcPr/>
+                <w:p>
+                  <w:pPr>
+                    <w:pStyle w:val="Compact"/>
+                    <w:jc w:val="left"/>
+                    <w:jc w:val="center"/>
+                  </w:pPr>
+                  <w:r>
+                    <w:t xml:space="preserve">FR</w:t>
+                  </w:r>
+                </w:p>
+              </w:tc>
+              <w:tc>
+                <w:tcPr/>
+                <w:p>
+                  <w:pPr>
+                    <w:pStyle w:val="Compact"/>
+                    <w:jc w:val="left"/>
+                    <w:jc w:val="center"/>
+                  </w:pPr>
+                  <w:r>
+                    <w:t xml:space="preserve">Environmental concern</w:t>
+                  </w:r>
+                </w:p>
+              </w:tc>
+              <w:tc>
+                <w:tcPr/>
+                <w:p>
+                  <w:pPr>
+                    <w:pStyle w:val="Compact"/>
+                    <w:jc w:val="left"/>
+                    <w:jc w:val="center"/>
+                  </w:pPr>
+                  <w:r>
+                    <w:t xml:space="preserve">6.2 [5.0, 8.4]</w:t>
+                  </w:r>
+                </w:p>
+              </w:tc>
+              <w:tc>
+                <w:tcPr/>
+                <w:p>
+                  <w:pPr>
+                    <w:pStyle w:val="Compact"/>
+                    <w:jc w:val="left"/>
+                    <w:jc w:val="center"/>
+                  </w:pPr>
+                  <w:r>
+                    <w:t xml:space="preserve">0.76</w:t>
+                  </w:r>
+                </w:p>
+              </w:tc>
+            </w:tr>
+            <w:tr>
+              <w:tc>
+                <w:tcPr/>
+                <w:p>
+                  <w:pPr>
+                    <w:pStyle w:val="Compact"/>
+                    <w:jc w:val="left"/>
+                    <w:jc w:val="center"/>
+                  </w:pPr>
+                  <w:r>
+                    <w:t xml:space="preserve">HR</w:t>
+                  </w:r>
+                </w:p>
+              </w:tc>
+              <w:tc>
+                <w:tcPr/>
+                <w:p>
+                  <w:pPr>
+                    <w:pStyle w:val="Compact"/>
+                    <w:jc w:val="left"/>
+                    <w:jc w:val="center"/>
+                  </w:pPr>
+                  <w:r>
+                    <w:t xml:space="preserve">Environmental concern</w:t>
+                  </w:r>
+                </w:p>
+              </w:tc>
+              <w:tc>
+                <w:tcPr/>
+                <w:p>
+                  <w:pPr>
+                    <w:pStyle w:val="Compact"/>
+                    <w:jc w:val="left"/>
+                    <w:jc w:val="center"/>
+                  </w:pPr>
+                  <w:r>
+                    <w:t xml:space="preserve">9.6 [6.8, 12.7]</w:t>
+                  </w:r>
+                </w:p>
+              </w:tc>
+              <w:tc>
+                <w:tcPr/>
+                <w:p>
+                  <w:pPr>
+                    <w:pStyle w:val="Compact"/>
+                    <w:jc w:val="left"/>
+                    <w:jc w:val="center"/>
+                  </w:pPr>
+                  <w:r>
+                    <w:t xml:space="preserve">0.25</w:t>
+                  </w:r>
+                </w:p>
+              </w:tc>
+            </w:tr>
+            <w:tr>
+              <w:tc>
+                <w:tcPr/>
+                <w:p>
+                  <w:pPr>
+                    <w:pStyle w:val="Compact"/>
+                    <w:jc w:val="left"/>
+                    <w:jc w:val="center"/>
+                  </w:pPr>
+                  <w:r>
+                    <w:t xml:space="preserve">HU</w:t>
+                  </w:r>
+                </w:p>
+              </w:tc>
+              <w:tc>
+                <w:tcPr/>
+                <w:p>
+                  <w:pPr>
+                    <w:pStyle w:val="Compact"/>
+                    <w:jc w:val="left"/>
+                    <w:jc w:val="center"/>
+                  </w:pPr>
+                  <w:r>
+                    <w:t xml:space="preserve">Willingness to sacrifice</w:t>
+                  </w:r>
+                </w:p>
+              </w:tc>
+              <w:tc>
+                <w:tcPr/>
+                <w:p>
+                  <w:pPr>
+                    <w:pStyle w:val="Compact"/>
+                    <w:jc w:val="left"/>
+                    <w:jc w:val="center"/>
+                  </w:pPr>
+                  <w:r>
+                    <w:t xml:space="preserve">4.0 [3.4, 5.7]</w:t>
                   </w:r>
                 </w:p>
               </w:tc>
@@ -7990,249 +8430,303 @@
                     <w:jc w:val="center"/>
                   </w:pPr>
                   <w:r>
-                    <w:t xml:space="preserve">CN</w:t>
-                  </w:r>
-                </w:p>
-              </w:tc>
-              <w:tc>
-                <w:tcPr/>
-                <w:p>
-                  <w:pPr>
-                    <w:pStyle w:val="Compact"/>
-                    <w:jc w:val="left"/>
-                    <w:jc w:val="center"/>
-                  </w:pPr>
-                  <w:r>
-                    <w:t xml:space="preserve">envcom</w:t>
-                  </w:r>
-                </w:p>
-              </w:tc>
-              <w:tc>
-                <w:tcPr/>
-                <w:p>
-                  <w:pPr>
-                    <w:pStyle w:val="Compact"/>
-                    <w:jc w:val="left"/>
-                    <w:jc w:val="center"/>
-                  </w:pPr>
-                  <w:r>
-                    <w:t xml:space="preserve">5.2 [4.5, 6.4]</w:t>
-                  </w:r>
-                </w:p>
-              </w:tc>
-              <w:tc>
-                <w:tcPr/>
-                <w:p>
-                  <w:pPr>
-                    <w:pStyle w:val="Compact"/>
-                    <w:jc w:val="left"/>
-                    <w:jc w:val="center"/>
-                  </w:pPr>
-                  <w:r>
-                    <w:t xml:space="preserve">1.00</w:t>
-                  </w:r>
-                </w:p>
-              </w:tc>
-            </w:tr>
-            <w:tr>
-              <w:tc>
-                <w:tcPr/>
-                <w:p>
-                  <w:pPr>
-                    <w:pStyle w:val="Compact"/>
-                    <w:jc w:val="left"/>
-                    <w:jc w:val="center"/>
-                  </w:pPr>
-                  <w:r>
-                    <w:t xml:space="preserve">DE</w:t>
-                  </w:r>
-                </w:p>
-              </w:tc>
-              <w:tc>
-                <w:tcPr/>
-                <w:p>
-                  <w:pPr>
-                    <w:pStyle w:val="Compact"/>
-                    <w:jc w:val="left"/>
-                    <w:jc w:val="center"/>
-                  </w:pPr>
-                  <w:r>
-                    <w:t xml:space="preserve">envcom</w:t>
-                  </w:r>
-                </w:p>
-              </w:tc>
-              <w:tc>
-                <w:tcPr/>
-                <w:p>
-                  <w:pPr>
-                    <w:pStyle w:val="Compact"/>
-                    <w:jc w:val="left"/>
-                    <w:jc w:val="center"/>
-                  </w:pPr>
-                  <w:r>
-                    <w:t xml:space="preserve">5.1 [4.3, 6.3]</w:t>
-                  </w:r>
-                </w:p>
-              </w:tc>
-              <w:tc>
-                <w:tcPr/>
-                <w:p>
-                  <w:pPr>
-                    <w:pStyle w:val="Compact"/>
-                    <w:jc w:val="left"/>
-                    <w:jc w:val="center"/>
-                  </w:pPr>
-                  <w:r>
-                    <w:t xml:space="preserve">1.00</w:t>
-                  </w:r>
-                </w:p>
-              </w:tc>
-            </w:tr>
-            <w:tr>
-              <w:tc>
-                <w:tcPr/>
-                <w:p>
-                  <w:pPr>
-                    <w:pStyle w:val="Compact"/>
-                    <w:jc w:val="left"/>
-                    <w:jc w:val="center"/>
-                  </w:pPr>
-                  <w:r>
-                    <w:t xml:space="preserve">DK</w:t>
-                  </w:r>
-                </w:p>
-              </w:tc>
-              <w:tc>
-                <w:tcPr/>
-                <w:p>
-                  <w:pPr>
-                    <w:pStyle w:val="Compact"/>
-                    <w:jc w:val="left"/>
-                    <w:jc w:val="center"/>
-                  </w:pPr>
-                  <w:r>
-                    <w:t xml:space="preserve">envcom</w:t>
-                  </w:r>
-                </w:p>
-              </w:tc>
-              <w:tc>
-                <w:tcPr/>
-                <w:p>
-                  <w:pPr>
-                    <w:pStyle w:val="Compact"/>
-                    <w:jc w:val="left"/>
-                    <w:jc w:val="center"/>
-                  </w:pPr>
-                  <w:r>
-                    <w:t xml:space="preserve">4.3 [3.6, 5.7]</w:t>
-                  </w:r>
-                </w:p>
-              </w:tc>
-              <w:tc>
-                <w:tcPr/>
-                <w:p>
-                  <w:pPr>
-                    <w:pStyle w:val="Compact"/>
-                    <w:jc w:val="left"/>
-                    <w:jc w:val="center"/>
-                  </w:pPr>
-                  <w:r>
-                    <w:t xml:space="preserve">1.00</w:t>
-                  </w:r>
-                </w:p>
-              </w:tc>
-            </w:tr>
-            <w:tr>
-              <w:tc>
-                <w:tcPr/>
-                <w:p>
-                  <w:pPr>
-                    <w:pStyle w:val="Compact"/>
-                    <w:jc w:val="left"/>
-                    <w:jc w:val="center"/>
-                  </w:pPr>
-                  <w:r>
-                    <w:t xml:space="preserve">ES</w:t>
-                  </w:r>
-                </w:p>
-              </w:tc>
-              <w:tc>
-                <w:tcPr/>
-                <w:p>
-                  <w:pPr>
-                    <w:pStyle w:val="Compact"/>
-                    <w:jc w:val="left"/>
-                    <w:jc w:val="center"/>
-                  </w:pPr>
-                  <w:r>
-                    <w:t xml:space="preserve">envcom</w:t>
-                  </w:r>
-                </w:p>
-              </w:tc>
-              <w:tc>
-                <w:tcPr/>
-                <w:p>
-                  <w:pPr>
-                    <w:pStyle w:val="Compact"/>
-                    <w:jc w:val="left"/>
-                    <w:jc w:val="center"/>
-                  </w:pPr>
-                  <w:r>
-                    <w:t xml:space="preserve">6.3 [5.2, 7.3]</w:t>
-                  </w:r>
-                </w:p>
-              </w:tc>
-              <w:tc>
-                <w:tcPr/>
-                <w:p>
-                  <w:pPr>
-                    <w:pStyle w:val="Compact"/>
-                    <w:jc w:val="left"/>
-                    <w:jc w:val="center"/>
-                  </w:pPr>
-                  <w:r>
-                    <w:t xml:space="preserve">0.99</w:t>
-                  </w:r>
-                </w:p>
-              </w:tc>
-            </w:tr>
-            <w:tr>
-              <w:tc>
-                <w:tcPr/>
-                <w:p>
-                  <w:pPr>
-                    <w:pStyle w:val="Compact"/>
-                    <w:jc w:val="left"/>
-                    <w:jc w:val="center"/>
-                  </w:pPr>
-                  <w:r>
-                    <w:t xml:space="preserve">FI</w:t>
-                  </w:r>
-                </w:p>
-              </w:tc>
-              <w:tc>
-                <w:tcPr/>
-                <w:p>
-                  <w:pPr>
-                    <w:pStyle w:val="Compact"/>
-                    <w:jc w:val="left"/>
-                    <w:jc w:val="center"/>
-                  </w:pPr>
-                  <w:r>
-                    <w:t xml:space="preserve">envcom</w:t>
-                  </w:r>
-                </w:p>
-              </w:tc>
-              <w:tc>
-                <w:tcPr/>
-                <w:p>
-                  <w:pPr>
-                    <w:pStyle w:val="Compact"/>
-                    <w:jc w:val="left"/>
-                    <w:jc w:val="center"/>
-                  </w:pPr>
-                  <w:r>
-                    <w:t xml:space="preserve">5.0 [4.5, 5.8]</w:t>
+                    <w:t xml:space="preserve">IN</w:t>
+                  </w:r>
+                </w:p>
+              </w:tc>
+              <w:tc>
+                <w:tcPr/>
+                <w:p>
+                  <w:pPr>
+                    <w:pStyle w:val="Compact"/>
+                    <w:jc w:val="left"/>
+                    <w:jc w:val="center"/>
+                  </w:pPr>
+                  <w:r>
+                    <w:t xml:space="preserve">Nature affinity</w:t>
+                  </w:r>
+                </w:p>
+              </w:tc>
+              <w:tc>
+                <w:tcPr/>
+                <w:p>
+                  <w:pPr>
+                    <w:pStyle w:val="Compact"/>
+                    <w:jc w:val="left"/>
+                    <w:jc w:val="center"/>
+                  </w:pPr>
+                  <w:r>
+                    <w:t xml:space="preserve">8.1 [5.7, 10.5]</w:t>
+                  </w:r>
+                </w:p>
+              </w:tc>
+              <w:tc>
+                <w:tcPr/>
+                <w:p>
+                  <w:pPr>
+                    <w:pStyle w:val="Compact"/>
+                    <w:jc w:val="left"/>
+                    <w:jc w:val="center"/>
+                  </w:pPr>
+                  <w:r>
+                    <w:t xml:space="preserve">0.96</w:t>
+                  </w:r>
+                </w:p>
+              </w:tc>
+            </w:tr>
+            <w:tr>
+              <w:tc>
+                <w:tcPr/>
+                <w:p>
+                  <w:pPr>
+                    <w:pStyle w:val="Compact"/>
+                    <w:jc w:val="left"/>
+                    <w:jc w:val="center"/>
+                  </w:pPr>
+                  <w:r>
+                    <w:t xml:space="preserve">IS</w:t>
+                  </w:r>
+                </w:p>
+              </w:tc>
+              <w:tc>
+                <w:tcPr/>
+                <w:p>
+                  <w:pPr>
+                    <w:pStyle w:val="Compact"/>
+                    <w:jc w:val="left"/>
+                    <w:jc w:val="center"/>
+                  </w:pPr>
+                  <w:r>
+                    <w:t xml:space="preserve">Nature affinity</w:t>
+                  </w:r>
+                </w:p>
+              </w:tc>
+              <w:tc>
+                <w:tcPr/>
+                <w:p>
+                  <w:pPr>
+                    <w:pStyle w:val="Compact"/>
+                    <w:jc w:val="left"/>
+                    <w:jc w:val="center"/>
+                  </w:pPr>
+                  <w:r>
+                    <w:t xml:space="preserve">6.9 [5.5, 9.5]</w:t>
+                  </w:r>
+                </w:p>
+              </w:tc>
+              <w:tc>
+                <w:tcPr/>
+                <w:p>
+                  <w:pPr>
+                    <w:pStyle w:val="Compact"/>
+                    <w:jc w:val="left"/>
+                    <w:jc w:val="center"/>
+                  </w:pPr>
+                  <w:r>
+                    <w:t xml:space="preserve">0.66</w:t>
+                  </w:r>
+                </w:p>
+              </w:tc>
+            </w:tr>
+            <w:tr>
+              <w:tc>
+                <w:tcPr/>
+                <w:p>
+                  <w:pPr>
+                    <w:pStyle w:val="Compact"/>
+                    <w:jc w:val="left"/>
+                    <w:jc w:val="center"/>
+                  </w:pPr>
+                  <w:r>
+                    <w:t xml:space="preserve">IT</w:t>
+                  </w:r>
+                </w:p>
+              </w:tc>
+              <w:tc>
+                <w:tcPr/>
+                <w:p>
+                  <w:pPr>
+                    <w:pStyle w:val="Compact"/>
+                    <w:jc w:val="left"/>
+                    <w:jc w:val="center"/>
+                  </w:pPr>
+                  <w:r>
+                    <w:t xml:space="preserve">Willingness to sacrifice</w:t>
+                  </w:r>
+                </w:p>
+              </w:tc>
+              <w:tc>
+                <w:tcPr/>
+                <w:p>
+                  <w:pPr>
+                    <w:pStyle w:val="Compact"/>
+                    <w:jc w:val="left"/>
+                    <w:jc w:val="center"/>
+                  </w:pPr>
+                  <w:r>
+                    <w:t xml:space="preserve">4.8 [3.7, 6.9]</w:t>
+                  </w:r>
+                </w:p>
+              </w:tc>
+              <w:tc>
+                <w:tcPr/>
+                <w:p>
+                  <w:pPr>
+                    <w:pStyle w:val="Compact"/>
+                    <w:jc w:val="left"/>
+                    <w:jc w:val="center"/>
+                  </w:pPr>
+                  <w:r>
+                    <w:t xml:space="preserve">0.98</w:t>
+                  </w:r>
+                </w:p>
+              </w:tc>
+            </w:tr>
+            <w:tr>
+              <w:tc>
+                <w:tcPr/>
+                <w:p>
+                  <w:pPr>
+                    <w:pStyle w:val="Compact"/>
+                    <w:jc w:val="left"/>
+                    <w:jc w:val="center"/>
+                  </w:pPr>
+                  <w:r>
+                    <w:t xml:space="preserve">JP</w:t>
+                  </w:r>
+                </w:p>
+              </w:tc>
+              <w:tc>
+                <w:tcPr/>
+                <w:p>
+                  <w:pPr>
+                    <w:pStyle w:val="Compact"/>
+                    <w:jc w:val="left"/>
+                    <w:jc w:val="center"/>
+                  </w:pPr>
+                  <w:r>
+                    <w:t xml:space="preserve">Willingness to sacrifice</w:t>
+                  </w:r>
+                </w:p>
+              </w:tc>
+              <w:tc>
+                <w:tcPr/>
+                <w:p>
+                  <w:pPr>
+                    <w:pStyle w:val="Compact"/>
+                    <w:jc w:val="left"/>
+                    <w:jc w:val="center"/>
+                  </w:pPr>
+                  <w:r>
+                    <w:t xml:space="preserve">6.0 [4.5, 9.4]</w:t>
+                  </w:r>
+                </w:p>
+              </w:tc>
+              <w:tc>
+                <w:tcPr/>
+                <w:p>
+                  <w:pPr>
+                    <w:pStyle w:val="Compact"/>
+                    <w:jc w:val="left"/>
+                    <w:jc w:val="center"/>
+                  </w:pPr>
+                  <w:r>
+                    <w:t xml:space="preserve">0.92</w:t>
+                  </w:r>
+                </w:p>
+              </w:tc>
+            </w:tr>
+            <w:tr>
+              <w:tc>
+                <w:tcPr/>
+                <w:p>
+                  <w:pPr>
+                    <w:pStyle w:val="Compact"/>
+                    <w:jc w:val="left"/>
+                    <w:jc w:val="center"/>
+                  </w:pPr>
+                  <w:r>
+                    <w:t xml:space="preserve">KR</w:t>
+                  </w:r>
+                </w:p>
+              </w:tc>
+              <w:tc>
+                <w:tcPr/>
+                <w:p>
+                  <w:pPr>
+                    <w:pStyle w:val="Compact"/>
+                    <w:jc w:val="left"/>
+                    <w:jc w:val="center"/>
+                  </w:pPr>
+                  <w:r>
+                    <w:t xml:space="preserve">Willingness to sacrifice</w:t>
+                  </w:r>
+                </w:p>
+              </w:tc>
+              <w:tc>
+                <w:tcPr/>
+                <w:p>
+                  <w:pPr>
+                    <w:pStyle w:val="Compact"/>
+                    <w:jc w:val="left"/>
+                    <w:jc w:val="center"/>
+                  </w:pPr>
+                  <w:r>
+                    <w:t xml:space="preserve">9.3 [6.0, 13.4]</w:t>
+                  </w:r>
+                </w:p>
+              </w:tc>
+              <w:tc>
+                <w:tcPr/>
+                <w:p>
+                  <w:pPr>
+                    <w:pStyle w:val="Compact"/>
+                    <w:jc w:val="left"/>
+                    <w:jc w:val="center"/>
+                  </w:pPr>
+                  <w:r>
+                    <w:t xml:space="preserve">0.82</w:t>
+                  </w:r>
+                </w:p>
+              </w:tc>
+            </w:tr>
+            <w:tr>
+              <w:tc>
+                <w:tcPr/>
+                <w:p>
+                  <w:pPr>
+                    <w:pStyle w:val="Compact"/>
+                    <w:jc w:val="left"/>
+                    <w:jc w:val="center"/>
+                  </w:pPr>
+                  <w:r>
+                    <w:t xml:space="preserve">LT</w:t>
+                  </w:r>
+                </w:p>
+              </w:tc>
+              <w:tc>
+                <w:tcPr/>
+                <w:p>
+                  <w:pPr>
+                    <w:pStyle w:val="Compact"/>
+                    <w:jc w:val="left"/>
+                    <w:jc w:val="center"/>
+                  </w:pPr>
+                  <w:r>
+                    <w:t xml:space="preserve">Willingness to sacrifice</w:t>
+                  </w:r>
+                </w:p>
+              </w:tc>
+              <w:tc>
+                <w:tcPr/>
+                <w:p>
+                  <w:pPr>
+                    <w:pStyle w:val="Compact"/>
+                    <w:jc w:val="left"/>
+                    <w:jc w:val="center"/>
+                  </w:pPr>
+                  <w:r>
+                    <w:t xml:space="preserve">5.6 [4.5, 7.8]</w:t>
                   </w:r>
                 </w:p>
               </w:tc>
@@ -8260,357 +8754,573 @@
                     <w:jc w:val="center"/>
                   </w:pPr>
                   <w:r>
-                    <w:t xml:space="preserve">FR</w:t>
-                  </w:r>
-                </w:p>
-              </w:tc>
-              <w:tc>
-                <w:tcPr/>
-                <w:p>
-                  <w:pPr>
-                    <w:pStyle w:val="Compact"/>
-                    <w:jc w:val="left"/>
-                    <w:jc w:val="center"/>
-                  </w:pPr>
-                  <w:r>
-                    <w:t xml:space="preserve">envcom</w:t>
-                  </w:r>
-                </w:p>
-              </w:tc>
-              <w:tc>
-                <w:tcPr/>
-                <w:p>
-                  <w:pPr>
-                    <w:pStyle w:val="Compact"/>
-                    <w:jc w:val="left"/>
-                    <w:jc w:val="center"/>
-                  </w:pPr>
-                  <w:r>
-                    <w:t xml:space="preserve">5.2 [4.3, 6.6]</w:t>
-                  </w:r>
-                </w:p>
-              </w:tc>
-              <w:tc>
-                <w:tcPr/>
-                <w:p>
-                  <w:pPr>
-                    <w:pStyle w:val="Compact"/>
-                    <w:jc w:val="left"/>
-                    <w:jc w:val="center"/>
-                  </w:pPr>
-                  <w:r>
-                    <w:t xml:space="preserve">0.91</w:t>
-                  </w:r>
-                </w:p>
-              </w:tc>
-            </w:tr>
-            <w:tr>
-              <w:tc>
-                <w:tcPr/>
-                <w:p>
-                  <w:pPr>
-                    <w:pStyle w:val="Compact"/>
-                    <w:jc w:val="left"/>
-                    <w:jc w:val="center"/>
-                  </w:pPr>
-                  <w:r>
-                    <w:t xml:space="preserve">HR</w:t>
-                  </w:r>
-                </w:p>
-              </w:tc>
-              <w:tc>
-                <w:tcPr/>
-                <w:p>
-                  <w:pPr>
-                    <w:pStyle w:val="Compact"/>
-                    <w:jc w:val="left"/>
-                    <w:jc w:val="center"/>
-                  </w:pPr>
-                  <w:r>
-                    <w:t xml:space="preserve">envcom</w:t>
-                  </w:r>
-                </w:p>
-              </w:tc>
-              <w:tc>
-                <w:tcPr/>
-                <w:p>
-                  <w:pPr>
-                    <w:pStyle w:val="Compact"/>
-                    <w:jc w:val="left"/>
-                    <w:jc w:val="center"/>
-                  </w:pPr>
-                  <w:r>
-                    <w:t xml:space="preserve">5.6 [4.4, 7.6]</w:t>
-                  </w:r>
-                </w:p>
-              </w:tc>
-              <w:tc>
-                <w:tcPr/>
-                <w:p>
-                  <w:pPr>
-                    <w:pStyle w:val="Compact"/>
-                    <w:jc w:val="left"/>
-                    <w:jc w:val="center"/>
-                  </w:pPr>
-                  <w:r>
-                    <w:t xml:space="preserve">0.90</w:t>
-                  </w:r>
-                </w:p>
-              </w:tc>
-            </w:tr>
-            <w:tr>
-              <w:tc>
-                <w:tcPr/>
-                <w:p>
-                  <w:pPr>
-                    <w:pStyle w:val="Compact"/>
-                    <w:jc w:val="left"/>
-                    <w:jc w:val="center"/>
-                  </w:pPr>
-                  <w:r>
-                    <w:t xml:space="preserve">HU</w:t>
-                  </w:r>
-                </w:p>
-              </w:tc>
-              <w:tc>
-                <w:tcPr/>
-                <w:p>
-                  <w:pPr>
-                    <w:pStyle w:val="Compact"/>
-                    <w:jc w:val="left"/>
-                    <w:jc w:val="center"/>
-                  </w:pPr>
-                  <w:r>
-                    <w:t xml:space="preserve">envcom</w:t>
-                  </w:r>
-                </w:p>
-              </w:tc>
-              <w:tc>
-                <w:tcPr/>
-                <w:p>
-                  <w:pPr>
-                    <w:pStyle w:val="Compact"/>
-                    <w:jc w:val="left"/>
-                    <w:jc w:val="center"/>
-                  </w:pPr>
-                  <w:r>
-                    <w:t xml:space="preserve">4.2 [3.3, 6.0]</w:t>
-                  </w:r>
-                </w:p>
-              </w:tc>
-              <w:tc>
-                <w:tcPr/>
-                <w:p>
-                  <w:pPr>
-                    <w:pStyle w:val="Compact"/>
-                    <w:jc w:val="left"/>
-                    <w:jc w:val="center"/>
-                  </w:pPr>
-                  <w:r>
-                    <w:t xml:space="preserve">1.00</w:t>
-                  </w:r>
-                </w:p>
-              </w:tc>
-            </w:tr>
-            <w:tr>
-              <w:tc>
-                <w:tcPr/>
-                <w:p>
-                  <w:pPr>
-                    <w:pStyle w:val="Compact"/>
-                    <w:jc w:val="left"/>
-                    <w:jc w:val="center"/>
-                  </w:pPr>
-                  <w:r>
-                    <w:t xml:space="preserve">IN</w:t>
-                  </w:r>
-                </w:p>
-              </w:tc>
-              <w:tc>
-                <w:tcPr/>
-                <w:p>
-                  <w:pPr>
-                    <w:pStyle w:val="Compact"/>
-                    <w:jc w:val="left"/>
-                    <w:jc w:val="center"/>
-                  </w:pPr>
-                  <w:r>
-                    <w:t xml:space="preserve">nature</w:t>
-                  </w:r>
-                </w:p>
-              </w:tc>
-              <w:tc>
-                <w:tcPr/>
-                <w:p>
-                  <w:pPr>
-                    <w:pStyle w:val="Compact"/>
-                    <w:jc w:val="left"/>
-                    <w:jc w:val="center"/>
-                  </w:pPr>
-                  <w:r>
-                    <w:t xml:space="preserve">8.0 [5.8, 11.4]</w:t>
-                  </w:r>
-                </w:p>
-              </w:tc>
-              <w:tc>
-                <w:tcPr/>
-                <w:p>
-                  <w:pPr>
-                    <w:pStyle w:val="Compact"/>
-                    <w:jc w:val="left"/>
-                    <w:jc w:val="center"/>
-                  </w:pPr>
-                  <w:r>
-                    <w:t xml:space="preserve">0.97</w:t>
-                  </w:r>
-                </w:p>
-              </w:tc>
-            </w:tr>
-            <w:tr>
-              <w:tc>
-                <w:tcPr/>
-                <w:p>
-                  <w:pPr>
-                    <w:pStyle w:val="Compact"/>
-                    <w:jc w:val="left"/>
-                    <w:jc w:val="center"/>
-                  </w:pPr>
-                  <w:r>
-                    <w:t xml:space="preserve">IS</w:t>
-                  </w:r>
-                </w:p>
-              </w:tc>
-              <w:tc>
-                <w:tcPr/>
-                <w:p>
-                  <w:pPr>
-                    <w:pStyle w:val="Compact"/>
-                    <w:jc w:val="left"/>
-                    <w:jc w:val="center"/>
-                  </w:pPr>
-                  <w:r>
-                    <w:t xml:space="preserve">envcom</w:t>
-                  </w:r>
-                </w:p>
-              </w:tc>
-              <w:tc>
-                <w:tcPr/>
-                <w:p>
-                  <w:pPr>
-                    <w:pStyle w:val="Compact"/>
-                    <w:jc w:val="left"/>
-                    <w:jc w:val="center"/>
-                  </w:pPr>
-                  <w:r>
-                    <w:t xml:space="preserve">6.1 [4.9, 7.7]</w:t>
-                  </w:r>
-                </w:p>
-              </w:tc>
-              <w:tc>
-                <w:tcPr/>
-                <w:p>
-                  <w:pPr>
-                    <w:pStyle w:val="Compact"/>
-                    <w:jc w:val="left"/>
-                    <w:jc w:val="center"/>
-                  </w:pPr>
-                  <w:r>
-                    <w:t xml:space="preserve">0.68</w:t>
-                  </w:r>
-                </w:p>
-              </w:tc>
-            </w:tr>
-            <w:tr>
-              <w:tc>
-                <w:tcPr/>
-                <w:p>
-                  <w:pPr>
-                    <w:pStyle w:val="Compact"/>
-                    <w:jc w:val="left"/>
-                    <w:jc w:val="center"/>
-                  </w:pPr>
-                  <w:r>
-                    <w:t xml:space="preserve">IT</w:t>
-                  </w:r>
-                </w:p>
-              </w:tc>
-              <w:tc>
-                <w:tcPr/>
-                <w:p>
-                  <w:pPr>
-                    <w:pStyle w:val="Compact"/>
-                    <w:jc w:val="left"/>
-                    <w:jc w:val="center"/>
-                  </w:pPr>
-                  <w:r>
-                    <w:t xml:space="preserve">envcom</w:t>
-                  </w:r>
-                </w:p>
-              </w:tc>
-              <w:tc>
-                <w:tcPr/>
-                <w:p>
-                  <w:pPr>
-                    <w:pStyle w:val="Compact"/>
-                    <w:jc w:val="left"/>
-                    <w:jc w:val="center"/>
-                  </w:pPr>
-                  <w:r>
-                    <w:t xml:space="preserve">3.3 [2.8, 3.9]</w:t>
-                  </w:r>
-                </w:p>
-              </w:tc>
-              <w:tc>
-                <w:tcPr/>
-                <w:p>
-                  <w:pPr>
-                    <w:pStyle w:val="Compact"/>
-                    <w:jc w:val="left"/>
-                    <w:jc w:val="center"/>
-                  </w:pPr>
-                  <w:r>
-                    <w:t xml:space="preserve">1.00</w:t>
-                  </w:r>
-                </w:p>
-              </w:tc>
-            </w:tr>
-            <w:tr>
-              <w:tc>
-                <w:tcPr/>
-                <w:p>
-                  <w:pPr>
-                    <w:pStyle w:val="Compact"/>
-                    <w:jc w:val="left"/>
-                    <w:jc w:val="center"/>
-                  </w:pPr>
-                  <w:r>
-                    <w:t xml:space="preserve">JP</w:t>
-                  </w:r>
-                </w:p>
-              </w:tc>
-              <w:tc>
-                <w:tcPr/>
-                <w:p>
-                  <w:pPr>
-                    <w:pStyle w:val="Compact"/>
-                    <w:jc w:val="left"/>
-                    <w:jc w:val="center"/>
-                  </w:pPr>
-                  <w:r>
-                    <w:t xml:space="preserve">envcom</w:t>
-                  </w:r>
-                </w:p>
-              </w:tc>
-              <w:tc>
-                <w:tcPr/>
-                <w:p>
-                  <w:pPr>
-                    <w:pStyle w:val="Compact"/>
-                    <w:jc w:val="left"/>
-                    <w:jc w:val="center"/>
-                  </w:pPr>
-                  <w:r>
-                    <w:t xml:space="preserve">4.9 [4.0, 7.2]</w:t>
+                    <w:t xml:space="preserve">NO</w:t>
+                  </w:r>
+                </w:p>
+              </w:tc>
+              <w:tc>
+                <w:tcPr/>
+                <w:p>
+                  <w:pPr>
+                    <w:pStyle w:val="Compact"/>
+                    <w:jc w:val="left"/>
+                    <w:jc w:val="center"/>
+                  </w:pPr>
+                  <w:r>
+                    <w:t xml:space="preserve">Willingness to sacrifice</w:t>
+                  </w:r>
+                </w:p>
+              </w:tc>
+              <w:tc>
+                <w:tcPr/>
+                <w:p>
+                  <w:pPr>
+                    <w:pStyle w:val="Compact"/>
+                    <w:jc w:val="left"/>
+                    <w:jc w:val="center"/>
+                  </w:pPr>
+                  <w:r>
+                    <w:t xml:space="preserve">8.6 [6.0, 10.2]</w:t>
+                  </w:r>
+                </w:p>
+              </w:tc>
+              <w:tc>
+                <w:tcPr/>
+                <w:p>
+                  <w:pPr>
+                    <w:pStyle w:val="Compact"/>
+                    <w:jc w:val="left"/>
+                    <w:jc w:val="center"/>
+                  </w:pPr>
+                  <w:r>
+                    <w:t xml:space="preserve">0.55</w:t>
+                  </w:r>
+                </w:p>
+              </w:tc>
+            </w:tr>
+            <w:tr>
+              <w:tc>
+                <w:tcPr/>
+                <w:p>
+                  <w:pPr>
+                    <w:pStyle w:val="Compact"/>
+                    <w:jc w:val="left"/>
+                    <w:jc w:val="center"/>
+                  </w:pPr>
+                  <w:r>
+                    <w:t xml:space="preserve">NZ</w:t>
+                  </w:r>
+                </w:p>
+              </w:tc>
+              <w:tc>
+                <w:tcPr/>
+                <w:p>
+                  <w:pPr>
+                    <w:pStyle w:val="Compact"/>
+                    <w:jc w:val="left"/>
+                    <w:jc w:val="center"/>
+                  </w:pPr>
+                  <w:r>
+                    <w:t xml:space="preserve">Environmental concern</w:t>
+                  </w:r>
+                </w:p>
+              </w:tc>
+              <w:tc>
+                <w:tcPr/>
+                <w:p>
+                  <w:pPr>
+                    <w:pStyle w:val="Compact"/>
+                    <w:jc w:val="left"/>
+                    <w:jc w:val="center"/>
+                  </w:pPr>
+                  <w:r>
+                    <w:t xml:space="preserve">6.5 [4.9, 9.9]</w:t>
+                  </w:r>
+                </w:p>
+              </w:tc>
+              <w:tc>
+                <w:tcPr/>
+                <w:p>
+                  <w:pPr>
+                    <w:pStyle w:val="Compact"/>
+                    <w:jc w:val="left"/>
+                    <w:jc w:val="center"/>
+                  </w:pPr>
+                  <w:r>
+                    <w:t xml:space="preserve">0.64</w:t>
+                  </w:r>
+                </w:p>
+              </w:tc>
+            </w:tr>
+            <w:tr>
+              <w:tc>
+                <w:tcPr/>
+                <w:p>
+                  <w:pPr>
+                    <w:pStyle w:val="Compact"/>
+                    <w:jc w:val="left"/>
+                    <w:jc w:val="center"/>
+                  </w:pPr>
+                  <w:r>
+                    <w:t xml:space="preserve">PH</w:t>
+                  </w:r>
+                </w:p>
+              </w:tc>
+              <w:tc>
+                <w:tcPr/>
+                <w:p>
+                  <w:pPr>
+                    <w:pStyle w:val="Compact"/>
+                    <w:jc w:val="left"/>
+                    <w:jc w:val="center"/>
+                  </w:pPr>
+                  <w:r>
+                    <w:t xml:space="preserve">Nature affinity</w:t>
+                  </w:r>
+                </w:p>
+              </w:tc>
+              <w:tc>
+                <w:tcPr/>
+                <w:p>
+                  <w:pPr>
+                    <w:pStyle w:val="Compact"/>
+                    <w:jc w:val="left"/>
+                    <w:jc w:val="center"/>
+                  </w:pPr>
+                  <w:r>
+                    <w:t xml:space="preserve">15.5 [8.2, 27.4]</w:t>
+                  </w:r>
+                </w:p>
+              </w:tc>
+              <w:tc>
+                <w:tcPr/>
+                <w:p>
+                  <w:pPr>
+                    <w:pStyle w:val="Compact"/>
+                    <w:jc w:val="left"/>
+                    <w:jc w:val="center"/>
+                  </w:pPr>
+                  <w:r>
+                    <w:t xml:space="preserve">0.64</w:t>
+                  </w:r>
+                </w:p>
+              </w:tc>
+            </w:tr>
+            <w:tr>
+              <w:tc>
+                <w:tcPr/>
+                <w:p>
+                  <w:pPr>
+                    <w:pStyle w:val="Compact"/>
+                    <w:jc w:val="left"/>
+                    <w:jc w:val="center"/>
+                  </w:pPr>
+                  <w:r>
+                    <w:t xml:space="preserve">RU</w:t>
+                  </w:r>
+                </w:p>
+              </w:tc>
+              <w:tc>
+                <w:tcPr/>
+                <w:p>
+                  <w:pPr>
+                    <w:pStyle w:val="Compact"/>
+                    <w:jc w:val="left"/>
+                    <w:jc w:val="center"/>
+                  </w:pPr>
+                  <w:r>
+                    <w:t xml:space="preserve">Willingness to sacrifice</w:t>
+                  </w:r>
+                </w:p>
+              </w:tc>
+              <w:tc>
+                <w:tcPr/>
+                <w:p>
+                  <w:pPr>
+                    <w:pStyle w:val="Compact"/>
+                    <w:jc w:val="left"/>
+                    <w:jc w:val="center"/>
+                  </w:pPr>
+                  <w:r>
+                    <w:t xml:space="preserve">6.6 [5.3, 8.5]</w:t>
+                  </w:r>
+                </w:p>
+              </w:tc>
+              <w:tc>
+                <w:tcPr/>
+                <w:p>
+                  <w:pPr>
+                    <w:pStyle w:val="Compact"/>
+                    <w:jc w:val="left"/>
+                    <w:jc w:val="center"/>
+                  </w:pPr>
+                  <w:r>
+                    <w:t xml:space="preserve">0.95</w:t>
+                  </w:r>
+                </w:p>
+              </w:tc>
+            </w:tr>
+            <w:tr>
+              <w:tc>
+                <w:tcPr/>
+                <w:p>
+                  <w:pPr>
+                    <w:pStyle w:val="Compact"/>
+                    <w:jc w:val="left"/>
+                    <w:jc w:val="center"/>
+                  </w:pPr>
+                  <w:r>
+                    <w:t xml:space="preserve">SE</w:t>
+                  </w:r>
+                </w:p>
+              </w:tc>
+              <w:tc>
+                <w:tcPr/>
+                <w:p>
+                  <w:pPr>
+                    <w:pStyle w:val="Compact"/>
+                    <w:jc w:val="left"/>
+                    <w:jc w:val="center"/>
+                  </w:pPr>
+                  <w:r>
+                    <w:t xml:space="preserve">Willingness to sacrifice</w:t>
+                  </w:r>
+                </w:p>
+              </w:tc>
+              <w:tc>
+                <w:tcPr/>
+                <w:p>
+                  <w:pPr>
+                    <w:pStyle w:val="Compact"/>
+                    <w:jc w:val="left"/>
+                    <w:jc w:val="center"/>
+                  </w:pPr>
+                  <w:r>
+                    <w:t xml:space="preserve">6.9 [5.7, 9.2]</w:t>
+                  </w:r>
+                </w:p>
+              </w:tc>
+              <w:tc>
+                <w:tcPr/>
+                <w:p>
+                  <w:pPr>
+                    <w:pStyle w:val="Compact"/>
+                    <w:jc w:val="left"/>
+                    <w:jc w:val="center"/>
+                  </w:pPr>
+                  <w:r>
+                    <w:t xml:space="preserve">0.59</w:t>
+                  </w:r>
+                </w:p>
+              </w:tc>
+            </w:tr>
+            <w:tr>
+              <w:tc>
+                <w:tcPr/>
+                <w:p>
+                  <w:pPr>
+                    <w:pStyle w:val="Compact"/>
+                    <w:jc w:val="left"/>
+                    <w:jc w:val="center"/>
+                  </w:pPr>
+                  <w:r>
+                    <w:t xml:space="preserve">SI</w:t>
+                  </w:r>
+                </w:p>
+              </w:tc>
+              <w:tc>
+                <w:tcPr/>
+                <w:p>
+                  <w:pPr>
+                    <w:pStyle w:val="Compact"/>
+                    <w:jc w:val="left"/>
+                    <w:jc w:val="center"/>
+                  </w:pPr>
+                  <w:r>
+                    <w:t xml:space="preserve">Environmental concern</w:t>
+                  </w:r>
+                </w:p>
+              </w:tc>
+              <w:tc>
+                <w:tcPr/>
+                <w:p>
+                  <w:pPr>
+                    <w:pStyle w:val="Compact"/>
+                    <w:jc w:val="left"/>
+                    <w:jc w:val="center"/>
+                  </w:pPr>
+                  <w:r>
+                    <w:t xml:space="preserve">7.1 [5.1, 10.7]</w:t>
+                  </w:r>
+                </w:p>
+              </w:tc>
+              <w:tc>
+                <w:tcPr/>
+                <w:p>
+                  <w:pPr>
+                    <w:pStyle w:val="Compact"/>
+                    <w:jc w:val="left"/>
+                    <w:jc w:val="center"/>
+                  </w:pPr>
+                  <w:r>
+                    <w:t xml:space="preserve">0.75</w:t>
+                  </w:r>
+                </w:p>
+              </w:tc>
+            </w:tr>
+            <w:tr>
+              <w:tc>
+                <w:tcPr/>
+                <w:p>
+                  <w:pPr>
+                    <w:pStyle w:val="Compact"/>
+                    <w:jc w:val="left"/>
+                    <w:jc w:val="center"/>
+                  </w:pPr>
+                  <w:r>
+                    <w:t xml:space="preserve">SK</w:t>
+                  </w:r>
+                </w:p>
+              </w:tc>
+              <w:tc>
+                <w:tcPr/>
+                <w:p>
+                  <w:pPr>
+                    <w:pStyle w:val="Compact"/>
+                    <w:jc w:val="left"/>
+                    <w:jc w:val="center"/>
+                  </w:pPr>
+                  <w:r>
+                    <w:t xml:space="preserve">Willingness to sacrifice</w:t>
+                  </w:r>
+                </w:p>
+              </w:tc>
+              <w:tc>
+                <w:tcPr/>
+                <w:p>
+                  <w:pPr>
+                    <w:pStyle w:val="Compact"/>
+                    <w:jc w:val="left"/>
+                    <w:jc w:val="center"/>
+                  </w:pPr>
+                  <w:r>
+                    <w:t xml:space="preserve">6.8 [5.1, 10.6]</w:t>
+                  </w:r>
+                </w:p>
+              </w:tc>
+              <w:tc>
+                <w:tcPr/>
+                <w:p>
+                  <w:pPr>
+                    <w:pStyle w:val="Compact"/>
+                    <w:jc w:val="left"/>
+                    <w:jc w:val="center"/>
+                  </w:pPr>
+                  <w:r>
+                    <w:t xml:space="preserve">0.47</w:t>
+                  </w:r>
+                </w:p>
+              </w:tc>
+            </w:tr>
+            <w:tr>
+              <w:tc>
+                <w:tcPr/>
+                <w:p>
+                  <w:pPr>
+                    <w:pStyle w:val="Compact"/>
+                    <w:jc w:val="left"/>
+                    <w:jc w:val="center"/>
+                  </w:pPr>
+                  <w:r>
+                    <w:t xml:space="preserve">TH</w:t>
+                  </w:r>
+                </w:p>
+              </w:tc>
+              <w:tc>
+                <w:tcPr/>
+                <w:p>
+                  <w:pPr>
+                    <w:pStyle w:val="Compact"/>
+                    <w:jc w:val="left"/>
+                    <w:jc w:val="center"/>
+                  </w:pPr>
+                  <w:r>
+                    <w:t xml:space="preserve">Environmental concern</w:t>
+                  </w:r>
+                </w:p>
+              </w:tc>
+              <w:tc>
+                <w:tcPr/>
+                <w:p>
+                  <w:pPr>
+                    <w:pStyle w:val="Compact"/>
+                    <w:jc w:val="left"/>
+                    <w:jc w:val="center"/>
+                  </w:pPr>
+                  <w:r>
+                    <w:t xml:space="preserve">6.2 [4.6, 8.5]</w:t>
+                  </w:r>
+                </w:p>
+              </w:tc>
+              <w:tc>
+                <w:tcPr/>
+                <w:p>
+                  <w:pPr>
+                    <w:pStyle w:val="Compact"/>
+                    <w:jc w:val="left"/>
+                    <w:jc w:val="center"/>
+                  </w:pPr>
+                  <w:r>
+                    <w:t xml:space="preserve">0.84</w:t>
+                  </w:r>
+                </w:p>
+              </w:tc>
+            </w:tr>
+            <w:tr>
+              <w:tc>
+                <w:tcPr/>
+                <w:p>
+                  <w:pPr>
+                    <w:pStyle w:val="Compact"/>
+                    <w:jc w:val="left"/>
+                    <w:jc w:val="center"/>
+                  </w:pPr>
+                  <w:r>
+                    <w:t xml:space="preserve">TW</w:t>
+                  </w:r>
+                </w:p>
+              </w:tc>
+              <w:tc>
+                <w:tcPr/>
+                <w:p>
+                  <w:pPr>
+                    <w:pStyle w:val="Compact"/>
+                    <w:jc w:val="left"/>
+                    <w:jc w:val="center"/>
+                  </w:pPr>
+                  <w:r>
+                    <w:t xml:space="preserve">Ecological worldview</w:t>
+                  </w:r>
+                </w:p>
+              </w:tc>
+              <w:tc>
+                <w:tcPr/>
+                <w:p>
+                  <w:pPr>
+                    <w:pStyle w:val="Compact"/>
+                    <w:jc w:val="left"/>
+                    <w:jc w:val="center"/>
+                  </w:pPr>
+                  <w:r>
+                    <w:t xml:space="preserve">8.7 [6.6, 11.8]</w:t>
+                  </w:r>
+                </w:p>
+              </w:tc>
+              <w:tc>
+                <w:tcPr/>
+                <w:p>
+                  <w:pPr>
+                    <w:pStyle w:val="Compact"/>
+                    <w:jc w:val="left"/>
+                    <w:jc w:val="center"/>
+                  </w:pPr>
+                  <w:r>
+                    <w:t xml:space="preserve">0.33</w:t>
+                  </w:r>
+                </w:p>
+              </w:tc>
+            </w:tr>
+            <w:tr>
+              <w:tc>
+                <w:tcPr/>
+                <w:p>
+                  <w:pPr>
+                    <w:pStyle w:val="Compact"/>
+                    <w:jc w:val="left"/>
+                    <w:jc w:val="center"/>
+                  </w:pPr>
+                  <w:r>
+                    <w:t xml:space="preserve">US</w:t>
+                  </w:r>
+                </w:p>
+              </w:tc>
+              <w:tc>
+                <w:tcPr/>
+                <w:p>
+                  <w:pPr>
+                    <w:pStyle w:val="Compact"/>
+                    <w:jc w:val="left"/>
+                    <w:jc w:val="center"/>
+                  </w:pPr>
+                  <w:r>
+                    <w:t xml:space="preserve">Nature affinity</w:t>
+                  </w:r>
+                </w:p>
+              </w:tc>
+              <w:tc>
+                <w:tcPr/>
+                <w:p>
+                  <w:pPr>
+                    <w:pStyle w:val="Compact"/>
+                    <w:jc w:val="left"/>
+                    <w:jc w:val="center"/>
+                  </w:pPr>
+                  <w:r>
+                    <w:t xml:space="preserve">6.4 [4.7, 7.3]</w:t>
+                  </w:r>
+                </w:p>
+              </w:tc>
+              <w:tc>
+                <w:tcPr/>
+                <w:p>
+                  <w:pPr>
+                    <w:pStyle w:val="Compact"/>
+                    <w:jc w:val="left"/>
+                    <w:jc w:val="center"/>
+                  </w:pPr>
+                  <w:r>
+                    <w:t xml:space="preserve">0.83</w:t>
+                  </w:r>
+                </w:p>
+              </w:tc>
+            </w:tr>
+            <w:tr>
+              <w:tc>
+                <w:tcPr/>
+                <w:p>
+                  <w:pPr>
+                    <w:pStyle w:val="Compact"/>
+                    <w:jc w:val="left"/>
+                    <w:jc w:val="center"/>
+                  </w:pPr>
+                  <w:r>
+                    <w:t xml:space="preserve">ZA</w:t>
+                  </w:r>
+                </w:p>
+              </w:tc>
+              <w:tc>
+                <w:tcPr/>
+                <w:p>
+                  <w:pPr>
+                    <w:pStyle w:val="Compact"/>
+                    <w:jc w:val="left"/>
+                    <w:jc w:val="center"/>
+                  </w:pPr>
+                  <w:r>
+                    <w:t xml:space="preserve">Willingness to sacrifice</w:t>
+                  </w:r>
+                </w:p>
+              </w:tc>
+              <w:tc>
+                <w:tcPr/>
+                <w:p>
+                  <w:pPr>
+                    <w:pStyle w:val="Compact"/>
+                    <w:jc w:val="left"/>
+                    <w:jc w:val="center"/>
+                  </w:pPr>
+                  <w:r>
+                    <w:t xml:space="preserve">5.1 [4.4, 5.9]</w:t>
                   </w:r>
                 </w:p>
               </w:tc>
@@ -8624,708 +9334,6 @@
                   </w:pPr>
                   <w:r>
                     <w:t xml:space="preserve">0.98</w:t>
-                  </w:r>
-                </w:p>
-              </w:tc>
-            </w:tr>
-            <w:tr>
-              <w:tc>
-                <w:tcPr/>
-                <w:p>
-                  <w:pPr>
-                    <w:pStyle w:val="Compact"/>
-                    <w:jc w:val="left"/>
-                    <w:jc w:val="center"/>
-                  </w:pPr>
-                  <w:r>
-                    <w:t xml:space="preserve">KR</w:t>
-                  </w:r>
-                </w:p>
-              </w:tc>
-              <w:tc>
-                <w:tcPr/>
-                <w:p>
-                  <w:pPr>
-                    <w:pStyle w:val="Compact"/>
-                    <w:jc w:val="left"/>
-                    <w:jc w:val="center"/>
-                  </w:pPr>
-                  <w:r>
-                    <w:t xml:space="preserve">envcom</w:t>
-                  </w:r>
-                </w:p>
-              </w:tc>
-              <w:tc>
-                <w:tcPr/>
-                <w:p>
-                  <w:pPr>
-                    <w:pStyle w:val="Compact"/>
-                    <w:jc w:val="left"/>
-                    <w:jc w:val="center"/>
-                  </w:pPr>
-                  <w:r>
-                    <w:t xml:space="preserve">8.4 [5.5, 11.3]</w:t>
-                  </w:r>
-                </w:p>
-              </w:tc>
-              <w:tc>
-                <w:tcPr/>
-                <w:p>
-                  <w:pPr>
-                    <w:pStyle w:val="Compact"/>
-                    <w:jc w:val="left"/>
-                    <w:jc w:val="center"/>
-                  </w:pPr>
-                  <w:r>
-                    <w:t xml:space="preserve">0.96</w:t>
-                  </w:r>
-                </w:p>
-              </w:tc>
-            </w:tr>
-            <w:tr>
-              <w:tc>
-                <w:tcPr/>
-                <w:p>
-                  <w:pPr>
-                    <w:pStyle w:val="Compact"/>
-                    <w:jc w:val="left"/>
-                    <w:jc w:val="center"/>
-                  </w:pPr>
-                  <w:r>
-                    <w:t xml:space="preserve">LT</w:t>
-                  </w:r>
-                </w:p>
-              </w:tc>
-              <w:tc>
-                <w:tcPr/>
-                <w:p>
-                  <w:pPr>
-                    <w:pStyle w:val="Compact"/>
-                    <w:jc w:val="left"/>
-                    <w:jc w:val="center"/>
-                  </w:pPr>
-                  <w:r>
-                    <w:t xml:space="preserve">envcom</w:t>
-                  </w:r>
-                </w:p>
-              </w:tc>
-              <w:tc>
-                <w:tcPr/>
-                <w:p>
-                  <w:pPr>
-                    <w:pStyle w:val="Compact"/>
-                    <w:jc w:val="left"/>
-                    <w:jc w:val="center"/>
-                  </w:pPr>
-                  <w:r>
-                    <w:t xml:space="preserve">3.9 [3.4, 5.0]</w:t>
-                  </w:r>
-                </w:p>
-              </w:tc>
-              <w:tc>
-                <w:tcPr/>
-                <w:p>
-                  <w:pPr>
-                    <w:pStyle w:val="Compact"/>
-                    <w:jc w:val="left"/>
-                    <w:jc w:val="center"/>
-                  </w:pPr>
-                  <w:r>
-                    <w:t xml:space="preserve">1.00</w:t>
-                  </w:r>
-                </w:p>
-              </w:tc>
-            </w:tr>
-            <w:tr>
-              <w:tc>
-                <w:tcPr/>
-                <w:p>
-                  <w:pPr>
-                    <w:pStyle w:val="Compact"/>
-                    <w:jc w:val="left"/>
-                    <w:jc w:val="center"/>
-                  </w:pPr>
-                  <w:r>
-                    <w:t xml:space="preserve">NO</w:t>
-                  </w:r>
-                </w:p>
-              </w:tc>
-              <w:tc>
-                <w:tcPr/>
-                <w:p>
-                  <w:pPr>
-                    <w:pStyle w:val="Compact"/>
-                    <w:jc w:val="left"/>
-                    <w:jc w:val="center"/>
-                  </w:pPr>
-                  <w:r>
-                    <w:t xml:space="preserve">envcom</w:t>
-                  </w:r>
-                </w:p>
-              </w:tc>
-              <w:tc>
-                <w:tcPr/>
-                <w:p>
-                  <w:pPr>
-                    <w:pStyle w:val="Compact"/>
-                    <w:jc w:val="left"/>
-                    <w:jc w:val="center"/>
-                  </w:pPr>
-                  <w:r>
-                    <w:t xml:space="preserve">5.3 [4.3, 6.8]</w:t>
-                  </w:r>
-                </w:p>
-              </w:tc>
-              <w:tc>
-                <w:tcPr/>
-                <w:p>
-                  <w:pPr>
-                    <w:pStyle w:val="Compact"/>
-                    <w:jc w:val="left"/>
-                    <w:jc w:val="center"/>
-                  </w:pPr>
-                  <w:r>
-                    <w:t xml:space="preserve">0.97</w:t>
-                  </w:r>
-                </w:p>
-              </w:tc>
-            </w:tr>
-            <w:tr>
-              <w:tc>
-                <w:tcPr/>
-                <w:p>
-                  <w:pPr>
-                    <w:pStyle w:val="Compact"/>
-                    <w:jc w:val="left"/>
-                    <w:jc w:val="center"/>
-                  </w:pPr>
-                  <w:r>
-                    <w:t xml:space="preserve">NZ</w:t>
-                  </w:r>
-                </w:p>
-              </w:tc>
-              <w:tc>
-                <w:tcPr/>
-                <w:p>
-                  <w:pPr>
-                    <w:pStyle w:val="Compact"/>
-                    <w:jc w:val="left"/>
-                    <w:jc w:val="center"/>
-                  </w:pPr>
-                  <w:r>
-                    <w:t xml:space="preserve">envcom</w:t>
-                  </w:r>
-                </w:p>
-              </w:tc>
-              <w:tc>
-                <w:tcPr/>
-                <w:p>
-                  <w:pPr>
-                    <w:pStyle w:val="Compact"/>
-                    <w:jc w:val="left"/>
-                    <w:jc w:val="center"/>
-                  </w:pPr>
-                  <w:r>
-                    <w:t xml:space="preserve">5.7 [4.5, 7.7]</w:t>
-                  </w:r>
-                </w:p>
-              </w:tc>
-              <w:tc>
-                <w:tcPr/>
-                <w:p>
-                  <w:pPr>
-                    <w:pStyle w:val="Compact"/>
-                    <w:jc w:val="left"/>
-                    <w:jc w:val="center"/>
-                  </w:pPr>
-                  <w:r>
-                    <w:t xml:space="preserve">0.79</w:t>
-                  </w:r>
-                </w:p>
-              </w:tc>
-            </w:tr>
-            <w:tr>
-              <w:tc>
-                <w:tcPr/>
-                <w:p>
-                  <w:pPr>
-                    <w:pStyle w:val="Compact"/>
-                    <w:jc w:val="left"/>
-                    <w:jc w:val="center"/>
-                  </w:pPr>
-                  <w:r>
-                    <w:t xml:space="preserve">PH</w:t>
-                  </w:r>
-                </w:p>
-              </w:tc>
-              <w:tc>
-                <w:tcPr/>
-                <w:p>
-                  <w:pPr>
-                    <w:pStyle w:val="Compact"/>
-                    <w:jc w:val="left"/>
-                    <w:jc w:val="center"/>
-                  </w:pPr>
-                  <w:r>
-                    <w:t xml:space="preserve">nature</w:t>
-                  </w:r>
-                </w:p>
-              </w:tc>
-              <w:tc>
-                <w:tcPr/>
-                <w:p>
-                  <w:pPr>
-                    <w:pStyle w:val="Compact"/>
-                    <w:jc w:val="left"/>
-                    <w:jc w:val="center"/>
-                  </w:pPr>
-                  <w:r>
-                    <w:t xml:space="preserve">10.3 [7.8, 22.8]</w:t>
-                  </w:r>
-                </w:p>
-              </w:tc>
-              <w:tc>
-                <w:tcPr/>
-                <w:p>
-                  <w:pPr>
-                    <w:pStyle w:val="Compact"/>
-                    <w:jc w:val="left"/>
-                    <w:jc w:val="center"/>
-                  </w:pPr>
-                  <w:r>
-                    <w:t xml:space="preserve">0.77</w:t>
-                  </w:r>
-                </w:p>
-              </w:tc>
-            </w:tr>
-            <w:tr>
-              <w:tc>
-                <w:tcPr/>
-                <w:p>
-                  <w:pPr>
-                    <w:pStyle w:val="Compact"/>
-                    <w:jc w:val="left"/>
-                    <w:jc w:val="center"/>
-                  </w:pPr>
-                  <w:r>
-                    <w:t xml:space="preserve">RU</w:t>
-                  </w:r>
-                </w:p>
-              </w:tc>
-              <w:tc>
-                <w:tcPr/>
-                <w:p>
-                  <w:pPr>
-                    <w:pStyle w:val="Compact"/>
-                    <w:jc w:val="left"/>
-                    <w:jc w:val="center"/>
-                  </w:pPr>
-                  <w:r>
-                    <w:t xml:space="preserve">envcom</w:t>
-                  </w:r>
-                </w:p>
-              </w:tc>
-              <w:tc>
-                <w:tcPr/>
-                <w:p>
-                  <w:pPr>
-                    <w:pStyle w:val="Compact"/>
-                    <w:jc w:val="left"/>
-                    <w:jc w:val="center"/>
-                  </w:pPr>
-                  <w:r>
-                    <w:t xml:space="preserve">4.7 [4.0, 6.2]</w:t>
-                  </w:r>
-                </w:p>
-              </w:tc>
-              <w:tc>
-                <w:tcPr/>
-                <w:p>
-                  <w:pPr>
-                    <w:pStyle w:val="Compact"/>
-                    <w:jc w:val="left"/>
-                    <w:jc w:val="center"/>
-                  </w:pPr>
-                  <w:r>
-                    <w:t xml:space="preserve">1.00</w:t>
-                  </w:r>
-                </w:p>
-              </w:tc>
-            </w:tr>
-            <w:tr>
-              <w:tc>
-                <w:tcPr/>
-                <w:p>
-                  <w:pPr>
-                    <w:pStyle w:val="Compact"/>
-                    <w:jc w:val="left"/>
-                    <w:jc w:val="center"/>
-                  </w:pPr>
-                  <w:r>
-                    <w:t xml:space="preserve">SE</w:t>
-                  </w:r>
-                </w:p>
-              </w:tc>
-              <w:tc>
-                <w:tcPr/>
-                <w:p>
-                  <w:pPr>
-                    <w:pStyle w:val="Compact"/>
-                    <w:jc w:val="left"/>
-                    <w:jc w:val="center"/>
-                  </w:pPr>
-                  <w:r>
-                    <w:t xml:space="preserve">envcom</w:t>
-                  </w:r>
-                </w:p>
-              </w:tc>
-              <w:tc>
-                <w:tcPr/>
-                <w:p>
-                  <w:pPr>
-                    <w:pStyle w:val="Compact"/>
-                    <w:jc w:val="left"/>
-                    <w:jc w:val="center"/>
-                  </w:pPr>
-                  <w:r>
-                    <w:t xml:space="preserve">5.4 [4.6, 6.7]</w:t>
-                  </w:r>
-                </w:p>
-              </w:tc>
-              <w:tc>
-                <w:tcPr/>
-                <w:p>
-                  <w:pPr>
-                    <w:pStyle w:val="Compact"/>
-                    <w:jc w:val="left"/>
-                    <w:jc w:val="center"/>
-                  </w:pPr>
-                  <w:r>
-                    <w:t xml:space="preserve">0.96</w:t>
-                  </w:r>
-                </w:p>
-              </w:tc>
-            </w:tr>
-            <w:tr>
-              <w:tc>
-                <w:tcPr/>
-                <w:p>
-                  <w:pPr>
-                    <w:pStyle w:val="Compact"/>
-                    <w:jc w:val="left"/>
-                    <w:jc w:val="center"/>
-                  </w:pPr>
-                  <w:r>
-                    <w:t xml:space="preserve">SI</w:t>
-                  </w:r>
-                </w:p>
-              </w:tc>
-              <w:tc>
-                <w:tcPr/>
-                <w:p>
-                  <w:pPr>
-                    <w:pStyle w:val="Compact"/>
-                    <w:jc w:val="left"/>
-                    <w:jc w:val="center"/>
-                  </w:pPr>
-                  <w:r>
-                    <w:t xml:space="preserve">envcom</w:t>
-                  </w:r>
-                </w:p>
-              </w:tc>
-              <w:tc>
-                <w:tcPr/>
-                <w:p>
-                  <w:pPr>
-                    <w:pStyle w:val="Compact"/>
-                    <w:jc w:val="left"/>
-                    <w:jc w:val="center"/>
-                  </w:pPr>
-                  <w:r>
-                    <w:t xml:space="preserve">4.9 [3.9, 6.7]</w:t>
-                  </w:r>
-                </w:p>
-              </w:tc>
-              <w:tc>
-                <w:tcPr/>
-                <w:p>
-                  <w:pPr>
-                    <w:pStyle w:val="Compact"/>
-                    <w:jc w:val="left"/>
-                    <w:jc w:val="center"/>
-                  </w:pPr>
-                  <w:r>
-                    <w:t xml:space="preserve">1.00</w:t>
-                  </w:r>
-                </w:p>
-              </w:tc>
-            </w:tr>
-            <w:tr>
-              <w:tc>
-                <w:tcPr/>
-                <w:p>
-                  <w:pPr>
-                    <w:pStyle w:val="Compact"/>
-                    <w:jc w:val="left"/>
-                    <w:jc w:val="center"/>
-                  </w:pPr>
-                  <w:r>
-                    <w:t xml:space="preserve">SK</w:t>
-                  </w:r>
-                </w:p>
-              </w:tc>
-              <w:tc>
-                <w:tcPr/>
-                <w:p>
-                  <w:pPr>
-                    <w:pStyle w:val="Compact"/>
-                    <w:jc w:val="left"/>
-                    <w:jc w:val="center"/>
-                  </w:pPr>
-                  <w:r>
-                    <w:t xml:space="preserve">envcom</w:t>
-                  </w:r>
-                </w:p>
-              </w:tc>
-              <w:tc>
-                <w:tcPr/>
-                <w:p>
-                  <w:pPr>
-                    <w:pStyle w:val="Compact"/>
-                    <w:jc w:val="left"/>
-                    <w:jc w:val="center"/>
-                  </w:pPr>
-                  <w:r>
-                    <w:t xml:space="preserve">5.3 [4.0, 7.5]</w:t>
-                  </w:r>
-                </w:p>
-              </w:tc>
-              <w:tc>
-                <w:tcPr/>
-                <w:p>
-                  <w:pPr>
-                    <w:pStyle w:val="Compact"/>
-                    <w:jc w:val="left"/>
-                    <w:jc w:val="center"/>
-                  </w:pPr>
-                  <w:r>
-                    <w:t xml:space="preserve">0.66</w:t>
-                  </w:r>
-                </w:p>
-              </w:tc>
-            </w:tr>
-            <w:tr>
-              <w:tc>
-                <w:tcPr/>
-                <w:p>
-                  <w:pPr>
-                    <w:pStyle w:val="Compact"/>
-                    <w:jc w:val="left"/>
-                    <w:jc w:val="center"/>
-                  </w:pPr>
-                  <w:r>
-                    <w:t xml:space="preserve">TH</w:t>
-                  </w:r>
-                </w:p>
-              </w:tc>
-              <w:tc>
-                <w:tcPr/>
-                <w:p>
-                  <w:pPr>
-                    <w:pStyle w:val="Compact"/>
-                    <w:jc w:val="left"/>
-                    <w:jc w:val="center"/>
-                  </w:pPr>
-                  <w:r>
-                    <w:t xml:space="preserve">envcom</w:t>
-                  </w:r>
-                </w:p>
-              </w:tc>
-              <w:tc>
-                <w:tcPr/>
-                <w:p>
-                  <w:pPr>
-                    <w:pStyle w:val="Compact"/>
-                    <w:jc w:val="left"/>
-                    <w:jc w:val="center"/>
-                  </w:pPr>
-                  <w:r>
-                    <w:t xml:space="preserve">6.5 [4.7, 9.0]</w:t>
-                  </w:r>
-                </w:p>
-              </w:tc>
-              <w:tc>
-                <w:tcPr/>
-                <w:p>
-                  <w:pPr>
-                    <w:pStyle w:val="Compact"/>
-                    <w:jc w:val="left"/>
-                    <w:jc w:val="center"/>
-                  </w:pPr>
-                  <w:r>
-                    <w:t xml:space="preserve">0.81</w:t>
-                  </w:r>
-                </w:p>
-              </w:tc>
-            </w:tr>
-            <w:tr>
-              <w:tc>
-                <w:tcPr/>
-                <w:p>
-                  <w:pPr>
-                    <w:pStyle w:val="Compact"/>
-                    <w:jc w:val="left"/>
-                    <w:jc w:val="center"/>
-                  </w:pPr>
-                  <w:r>
-                    <w:t xml:space="preserve">TW</w:t>
-                  </w:r>
-                </w:p>
-              </w:tc>
-              <w:tc>
-                <w:tcPr/>
-                <w:p>
-                  <w:pPr>
-                    <w:pStyle w:val="Compact"/>
-                    <w:jc w:val="left"/>
-                    <w:jc w:val="center"/>
-                  </w:pPr>
-                  <w:r>
-                    <w:t xml:space="preserve">envcom</w:t>
-                  </w:r>
-                </w:p>
-              </w:tc>
-              <w:tc>
-                <w:tcPr/>
-                <w:p>
-                  <w:pPr>
-                    <w:pStyle w:val="Compact"/>
-                    <w:jc w:val="left"/>
-                    <w:jc w:val="center"/>
-                  </w:pPr>
-                  <w:r>
-                    <w:t xml:space="preserve">6.7 [5.1, 8.2]</w:t>
-                  </w:r>
-                </w:p>
-              </w:tc>
-              <w:tc>
-                <w:tcPr/>
-                <w:p>
-                  <w:pPr>
-                    <w:pStyle w:val="Compact"/>
-                    <w:jc w:val="left"/>
-                    <w:jc w:val="center"/>
-                  </w:pPr>
-                  <w:r>
-                    <w:t xml:space="preserve">0.88</w:t>
-                  </w:r>
-                </w:p>
-              </w:tc>
-            </w:tr>
-            <w:tr>
-              <w:tc>
-                <w:tcPr/>
-                <w:p>
-                  <w:pPr>
-                    <w:pStyle w:val="Compact"/>
-                    <w:jc w:val="left"/>
-                    <w:jc w:val="center"/>
-                  </w:pPr>
-                  <w:r>
-                    <w:t xml:space="preserve">US</w:t>
-                  </w:r>
-                </w:p>
-              </w:tc>
-              <w:tc>
-                <w:tcPr/>
-                <w:p>
-                  <w:pPr>
-                    <w:pStyle w:val="Compact"/>
-                    <w:jc w:val="left"/>
-                    <w:jc w:val="center"/>
-                  </w:pPr>
-                  <w:r>
-                    <w:t xml:space="preserve">nature</w:t>
-                  </w:r>
-                </w:p>
-              </w:tc>
-              <w:tc>
-                <w:tcPr/>
-                <w:p>
-                  <w:pPr>
-                    <w:pStyle w:val="Compact"/>
-                    <w:jc w:val="left"/>
-                    <w:jc w:val="center"/>
-                  </w:pPr>
-                  <w:r>
-                    <w:t xml:space="preserve">6.1 [4.5, 6.8]</w:t>
-                  </w:r>
-                </w:p>
-              </w:tc>
-              <w:tc>
-                <w:tcPr/>
-                <w:p>
-                  <w:pPr>
-                    <w:pStyle w:val="Compact"/>
-                    <w:jc w:val="left"/>
-                    <w:jc w:val="center"/>
-                  </w:pPr>
-                  <w:r>
-                    <w:t xml:space="preserve">0.60</w:t>
-                  </w:r>
-                </w:p>
-              </w:tc>
-            </w:tr>
-            <w:tr>
-              <w:tc>
-                <w:tcPr/>
-                <w:p>
-                  <w:pPr>
-                    <w:pStyle w:val="Compact"/>
-                    <w:jc w:val="left"/>
-                    <w:jc w:val="center"/>
-                  </w:pPr>
-                  <w:r>
-                    <w:t xml:space="preserve">ZA</w:t>
-                  </w:r>
-                </w:p>
-              </w:tc>
-              <w:tc>
-                <w:tcPr/>
-                <w:p>
-                  <w:pPr>
-                    <w:pStyle w:val="Compact"/>
-                    <w:jc w:val="left"/>
-                    <w:jc w:val="center"/>
-                  </w:pPr>
-                  <w:r>
-                    <w:t xml:space="preserve">envcom</w:t>
-                  </w:r>
-                </w:p>
-              </w:tc>
-              <w:tc>
-                <w:tcPr/>
-                <w:p>
-                  <w:pPr>
-                    <w:pStyle w:val="Compact"/>
-                    <w:jc w:val="left"/>
-                    <w:jc w:val="center"/>
-                  </w:pPr>
-                  <w:r>
-                    <w:t xml:space="preserve">4.8 [4.2, 5.7]</w:t>
-                  </w:r>
-                </w:p>
-              </w:tc>
-              <w:tc>
-                <w:tcPr/>
-                <w:p>
-                  <w:pPr>
-                    <w:pStyle w:val="Compact"/>
-                    <w:jc w:val="left"/>
-                    <w:jc w:val="center"/>
-                  </w:pPr>
-                  <w:r>
-                    <w:t xml:space="preserve">1.00</w:t>
                   </w:r>
                 </w:p>
               </w:tc>
@@ -9336,14 +9344,6 @@
         </w:tc>
       </w:tr>
     </w:tbl>
-    <w:p>
-      <w:pPr>
-        <w:pStyle w:val="BodyText"/>
-      </w:pPr>
-      <w:r>
-        <w:t xml:space="preserve">The six-item behavior specification was also run and is available in the replication files. It gives the same cross-country ordering but noisier per-country results, with the closest belief holding in a majority of resamples in 16 of 28 countries rather than 27.</w:t>
-      </w:r>
-    </w:p>
     <w:p>
       <w:r>
         <w:br w:type="page"/>

</xml_diff>